<commit_message>
New ming pao article
</commit_message>
<xml_diff>
--- a/static/CV.docx
+++ b/static/CV.docx
@@ -2301,14 +2301,35 @@
           <w:rFonts w:ascii="Times" w:hAnsi="Times" w:hint="eastAsia"/>
           <w:lang w:eastAsia="zh-TW"/>
         </w:rPr>
-        <w:t>租置計劃：從失敗教訓到全民共享</w:t>
-      </w:r>
-      <w:r>
-        <w:rPr>
-          <w:rFonts w:ascii="Times" w:hAnsi="Times" w:hint="eastAsia"/>
-          <w:lang w:eastAsia="zh-TW"/>
-        </w:rPr>
-        <w:t xml:space="preserve"> (</w:t>
+        <w:t>公營房屋改革</w:t>
+      </w:r>
+      <w:r>
+        <w:rPr>
+          <w:rFonts w:ascii="Times" w:hAnsi="Times"/>
+          <w:lang w:eastAsia="zh-TW"/>
+        </w:rPr>
+        <w:t xml:space="preserve"> </w:t>
+      </w:r>
+      <w:r>
+        <w:rPr>
+          <w:rFonts w:ascii="Times" w:hAnsi="Times" w:hint="eastAsia"/>
+          <w:lang w:eastAsia="zh-TW"/>
+        </w:rPr>
+        <w:t>會否冲跨私樓市場</w:t>
+      </w:r>
+      <w:r>
+        <w:rPr>
+          <w:rFonts w:ascii="Times" w:hAnsi="Times"/>
+          <w:lang w:eastAsia="zh-TW"/>
+        </w:rPr>
+        <w:t xml:space="preserve"> </w:t>
+      </w:r>
+      <w:r>
+        <w:rPr>
+          <w:rFonts w:ascii="Times" w:hAnsi="Times"/>
+          <w:lang w:eastAsia="zh-TW"/>
+        </w:rPr>
+        <w:t>(</w:t>
       </w:r>
       <w:r>
         <w:rPr>
@@ -2319,10 +2340,10 @@
       </w:r>
       <w:r>
         <w:rPr>
-          <w:rFonts w:ascii="Times" w:hAnsi="Times" w:hint="eastAsia"/>
-          <w:lang w:eastAsia="zh-TW"/>
-        </w:rPr>
-        <w:t xml:space="preserve">, 2025-7-31, </w:t>
+          <w:rFonts w:ascii="Times" w:hAnsi="Times"/>
+          <w:lang w:eastAsia="zh-TW"/>
+        </w:rPr>
+        <w:t xml:space="preserve">, 2025-8-21, </w:t>
       </w:r>
       <w:r>
         <w:rPr>
@@ -2333,7 +2354,7 @@
       </w:r>
       <w:r>
         <w:rPr>
-          <w:rFonts w:ascii="Times" w:hAnsi="Times" w:hint="eastAsia"/>
+          <w:rFonts w:ascii="Times" w:hAnsi="Times"/>
           <w:lang w:eastAsia="zh-TW"/>
         </w:rPr>
         <w:t>)</w:t>
@@ -2357,21 +2378,7 @@
           <w:rFonts w:ascii="Times" w:hAnsi="Times" w:hint="eastAsia"/>
           <w:lang w:eastAsia="zh-TW"/>
         </w:rPr>
-        <w:t>居屋二手市場流通窒息</w:t>
-      </w:r>
-      <w:r>
-        <w:rPr>
-          <w:rFonts w:ascii="Times" w:hAnsi="Times" w:hint="eastAsia"/>
-          <w:lang w:eastAsia="zh-TW"/>
-        </w:rPr>
-        <w:t xml:space="preserve"> </w:t>
-      </w:r>
-      <w:r>
-        <w:rPr>
-          <w:rFonts w:ascii="Times" w:hAnsi="Times" w:hint="eastAsia"/>
-          <w:lang w:eastAsia="zh-TW"/>
-        </w:rPr>
-        <w:t>買賣限制須大幅放寬</w:t>
+        <w:t>租置計劃：從失敗教訓到全民共享</w:t>
       </w:r>
       <w:r>
         <w:rPr>
@@ -2392,7 +2399,7 @@
           <w:rFonts w:ascii="Times" w:hAnsi="Times" w:hint="eastAsia"/>
           <w:lang w:eastAsia="zh-TW"/>
         </w:rPr>
-        <w:t xml:space="preserve">, 2025-7-3, </w:t>
+        <w:t xml:space="preserve">, 2025-7-31, </w:t>
       </w:r>
       <w:r>
         <w:rPr>
@@ -2406,7 +2413,7 @@
           <w:rFonts w:ascii="Times" w:hAnsi="Times" w:hint="eastAsia"/>
           <w:lang w:eastAsia="zh-TW"/>
         </w:rPr>
-        <w:t xml:space="preserve">) </w:t>
+        <w:t>)</w:t>
       </w:r>
     </w:p>
     <w:p>
@@ -2427,7 +2434,7 @@
           <w:rFonts w:ascii="Times" w:hAnsi="Times" w:hint="eastAsia"/>
           <w:lang w:eastAsia="zh-TW"/>
         </w:rPr>
-        <w:t>居屋嚴重短缺扭曲社會發展</w:t>
+        <w:t>居屋二手市場流通窒息</w:t>
       </w:r>
       <w:r>
         <w:rPr>
@@ -2441,7 +2448,7 @@
           <w:rFonts w:ascii="Times" w:hAnsi="Times" w:hint="eastAsia"/>
           <w:lang w:eastAsia="zh-TW"/>
         </w:rPr>
-        <w:t>需大幅擴建</w:t>
+        <w:t>買賣限制須大幅放寬</w:t>
       </w:r>
       <w:r>
         <w:rPr>
@@ -2462,7 +2469,7 @@
           <w:rFonts w:ascii="Times" w:hAnsi="Times" w:hint="eastAsia"/>
           <w:lang w:eastAsia="zh-TW"/>
         </w:rPr>
-        <w:t xml:space="preserve">, 2025-6-27, </w:t>
+        <w:t xml:space="preserve">, 2025-7-3, </w:t>
       </w:r>
       <w:r>
         <w:rPr>
@@ -2476,7 +2483,7 @@
           <w:rFonts w:ascii="Times" w:hAnsi="Times" w:hint="eastAsia"/>
           <w:lang w:eastAsia="zh-TW"/>
         </w:rPr>
-        <w:t>)</w:t>
+        <w:t xml:space="preserve">) </w:t>
       </w:r>
     </w:p>
     <w:p>
@@ -2497,7 +2504,7 @@
           <w:rFonts w:ascii="Times" w:hAnsi="Times" w:hint="eastAsia"/>
           <w:lang w:eastAsia="zh-TW"/>
         </w:rPr>
-        <w:t>現金津貼試行計劃退場</w:t>
+        <w:t>居屋嚴重短缺扭曲社會發展</w:t>
       </w:r>
       <w:r>
         <w:rPr>
@@ -2511,7 +2518,7 @@
           <w:rFonts w:ascii="Times" w:hAnsi="Times" w:hint="eastAsia"/>
           <w:lang w:eastAsia="zh-TW"/>
         </w:rPr>
-        <w:t>是明智決定——從經濟學理論看補貼轉型的必要性</w:t>
+        <w:t>需大幅擴建</w:t>
       </w:r>
       <w:r>
         <w:rPr>
@@ -2532,7 +2539,7 @@
           <w:rFonts w:ascii="Times" w:hAnsi="Times" w:hint="eastAsia"/>
           <w:lang w:eastAsia="zh-TW"/>
         </w:rPr>
-        <w:t xml:space="preserve">, 2025-6-5, </w:t>
+        <w:t xml:space="preserve">, 2025-6-27, </w:t>
       </w:r>
       <w:r>
         <w:rPr>
@@ -2546,7 +2553,7 @@
           <w:rFonts w:ascii="Times" w:hAnsi="Times" w:hint="eastAsia"/>
           <w:lang w:eastAsia="zh-TW"/>
         </w:rPr>
-        <w:t xml:space="preserve">) </w:t>
+        <w:t>)</w:t>
       </w:r>
     </w:p>
     <w:p>
@@ -2567,7 +2574,7 @@
           <w:rFonts w:ascii="Times" w:hAnsi="Times" w:hint="eastAsia"/>
           <w:lang w:eastAsia="zh-TW"/>
         </w:rPr>
-        <w:t>財赤之出路：賣公屋</w:t>
+        <w:t>現金津貼試行計劃退場</w:t>
       </w:r>
       <w:r>
         <w:rPr>
@@ -2581,7 +2588,7 @@
           <w:rFonts w:ascii="Times" w:hAnsi="Times" w:hint="eastAsia"/>
           <w:lang w:eastAsia="zh-TW"/>
         </w:rPr>
-        <w:t>救香港！</w:t>
+        <w:t>是明智決定——從經濟學理論看補貼轉型的必要性</w:t>
       </w:r>
       <w:r>
         <w:rPr>
@@ -2602,7 +2609,7 @@
           <w:rFonts w:ascii="Times" w:hAnsi="Times" w:hint="eastAsia"/>
           <w:lang w:eastAsia="zh-TW"/>
         </w:rPr>
-        <w:t xml:space="preserve">, 2025-4-24, </w:t>
+        <w:t xml:space="preserve">, 2025-6-5, </w:t>
       </w:r>
       <w:r>
         <w:rPr>
@@ -2616,7 +2623,7 @@
           <w:rFonts w:ascii="Times" w:hAnsi="Times" w:hint="eastAsia"/>
           <w:lang w:eastAsia="zh-TW"/>
         </w:rPr>
-        <w:t>)</w:t>
+        <w:t xml:space="preserve">) </w:t>
       </w:r>
     </w:p>
     <w:p>
@@ -2638,6 +2645,76 @@
           <w:lang w:eastAsia="zh-TW"/>
         </w:rPr>
         <w:lastRenderedPageBreak/>
+        <w:t>財赤之出路：賣公屋</w:t>
+      </w:r>
+      <w:r>
+        <w:rPr>
+          <w:rFonts w:ascii="Times" w:hAnsi="Times" w:hint="eastAsia"/>
+          <w:lang w:eastAsia="zh-TW"/>
+        </w:rPr>
+        <w:t xml:space="preserve"> </w:t>
+      </w:r>
+      <w:r>
+        <w:rPr>
+          <w:rFonts w:ascii="Times" w:hAnsi="Times" w:hint="eastAsia"/>
+          <w:lang w:eastAsia="zh-TW"/>
+        </w:rPr>
+        <w:t>救香港！</w:t>
+      </w:r>
+      <w:r>
+        <w:rPr>
+          <w:rFonts w:ascii="Times" w:hAnsi="Times" w:hint="eastAsia"/>
+          <w:lang w:eastAsia="zh-TW"/>
+        </w:rPr>
+        <w:t xml:space="preserve"> (</w:t>
+      </w:r>
+      <w:r>
+        <w:rPr>
+          <w:rFonts w:ascii="Times" w:hAnsi="Times" w:hint="eastAsia"/>
+          <w:lang w:eastAsia="zh-TW"/>
+        </w:rPr>
+        <w:t>明報</w:t>
+      </w:r>
+      <w:r>
+        <w:rPr>
+          <w:rFonts w:ascii="Times" w:hAnsi="Times" w:hint="eastAsia"/>
+          <w:lang w:eastAsia="zh-TW"/>
+        </w:rPr>
+        <w:t xml:space="preserve">, 2025-4-24, </w:t>
+      </w:r>
+      <w:r>
+        <w:rPr>
+          <w:rFonts w:ascii="Times" w:hAnsi="Times" w:hint="eastAsia"/>
+          <w:lang w:eastAsia="zh-TW"/>
+        </w:rPr>
+        <w:t>與牛致行和宋恩榮</w:t>
+      </w:r>
+      <w:r>
+        <w:rPr>
+          <w:rFonts w:ascii="Times" w:hAnsi="Times" w:hint="eastAsia"/>
+          <w:lang w:eastAsia="zh-TW"/>
+        </w:rPr>
+        <w:t>)</w:t>
+      </w:r>
+    </w:p>
+    <w:p>
+      <w:pPr>
+        <w:pStyle w:val="ListParagraph"/>
+        <w:numPr>
+          <w:ilvl w:val="0"/>
+          <w:numId w:val="1"/>
+        </w:numPr>
+        <w:spacing w:line="360" w:lineRule="auto"/>
+        <w:rPr>
+          <w:rFonts w:ascii="Times" w:hAnsi="Times"/>
+          <w:lang w:eastAsia="zh-TW"/>
+        </w:rPr>
+      </w:pPr>
+      <w:r>
+        <w:rPr>
+          <w:rFonts w:ascii="Times" w:hAnsi="Times" w:hint="eastAsia"/>
+          <w:lang w:eastAsia="zh-TW"/>
+        </w:rPr>
         <w:t>香港經濟面臨長期衰退</w:t>
       </w:r>
       <w:r>

</xml_diff>

<commit_message>
Update CV in sync with website; mark nexus & TPS forthcoming
- publications/list.yaml: "Managerial Coordination in Decentralized
  Markets" -> Economic Journal, forthcoming; "Subsidize Rent or Subsidize
  Homeownership?" -> Regional Science and Urban Economics, forthcoming
- CV.docx/CV.pdf resynced to the site: move Managerial Coordination to
  Publications (EJ forthcoming); JDE published; RSUE forthcoming; rebuild
  Working Papers (split Felix paper in two, rename Platform Currency ->
  Redemption Design and Digital Currency Adoption, add Relational Contracts
  and the Scope of Intermediary Firms, drop Skill Content of AI); drop
  Work-in-Progress; add 4 English + 10 Chinese articles; fix one date

Co-Authored-By: Claude Opus 4.8 (1M context) <noreply@anthropic.com>
</commit_message>
<xml_diff>
--- a/static/CV.docx
+++ b/static/CV.docx
@@ -1543,25 +1543,60 @@
         <w:rPr>
           <w:rFonts w:ascii="Times" w:hAnsi="Times"/>
         </w:rPr>
-        <w:t xml:space="preserve">“Ideological Bias and Trust in Information Sources” </w:t>
-      </w:r>
-      <w:r>
-        <w:rPr>
-          <w:rFonts w:ascii="Times" w:hAnsi="Times"/>
-        </w:rPr>
-        <w:t xml:space="preserve">(joint </w:t>
-      </w:r>
-      <w:r>
-        <w:rPr>
-          <w:rFonts w:ascii="Times" w:hAnsi="Times"/>
-        </w:rPr>
-        <w:t>with Matthew Gentzkow and Allen T. Zhang</w:t>
-      </w:r>
-      <w:r>
-        <w:rPr>
-          <w:rFonts w:ascii="Times" w:hAnsi="Times"/>
-        </w:rPr>
-        <w:t>)</w:t>
+        <w:t>“</w:t>
+      </w:r>
+      <w:r>
+        <w:rPr>
+          <w:rFonts w:ascii="Times" w:hAnsi="Times"/>
+          <w:lang w:eastAsia="zh-TW"/>
+        </w:rPr>
+        <w:t>Managerial Coordination</w:t>
+      </w:r>
+      <w:r>
+        <w:rPr>
+          <w:rFonts w:ascii="Times" w:hAnsi="Times" w:hint="eastAsia"/>
+          <w:lang w:eastAsia="zh-TW"/>
+        </w:rPr>
+        <w:t xml:space="preserve"> in</w:t>
+      </w:r>
+      <w:r>
+        <w:rPr>
+          <w:rFonts w:ascii="Times" w:hAnsi="Times"/>
+        </w:rPr>
+        <w:t xml:space="preserve"> Decentralized Markets</w:t>
+      </w:r>
+      <w:r>
+        <w:rPr>
+          <w:rFonts w:ascii="Times" w:hAnsi="Times" w:hint="eastAsia"/>
+          <w:lang w:eastAsia="zh-TW"/>
+        </w:rPr>
+        <w:t xml:space="preserve"/>
+      </w:r>
+      <w:r>
+        <w:rPr>
+          <w:rFonts w:ascii="Times" w:hAnsi="Times"/>
+        </w:rPr>
+        <w:t>”</w:t>
+      </w:r>
+      <w:r>
+        <w:rPr>
+          <w:rFonts w:ascii="Times" w:hAnsi="Times"/>
+        </w:rPr>
+        <w:t xml:space="preserve"> (with </w:t>
+      </w:r>
+      <w:proofErr w:type="spellStart"/>
+      <w:r>
+        <w:rPr>
+          <w:rFonts w:ascii="Times" w:hAnsi="Times"/>
+        </w:rPr>
+        <w:t>Duoxi</w:t>
+      </w:r>
+      <w:proofErr w:type="spellEnd"/>
+      <w:r>
+        <w:rPr>
+          <w:rFonts w:ascii="Times" w:hAnsi="Times"/>
+        </w:rPr>
+        <w:t xml:space="preserve"> Li)</w:t>
       </w:r>
       <w:r>
         <w:rPr>
@@ -1571,73 +1606,30 @@
       </w:r>
       <w:r>
         <w:rPr>
-          <w:rFonts w:ascii="Times" w:hAnsi="Times"/>
-          <w:i/>
-          <w:iCs/>
-        </w:rPr>
-        <w:t>A</w:t>
-      </w:r>
-      <w:r>
-        <w:rPr>
-          <w:rFonts w:ascii="Times" w:hAnsi="Times"/>
-          <w:i/>
-          <w:iCs/>
-        </w:rPr>
-        <w:t xml:space="preserve">merican </w:t>
-      </w:r>
-      <w:r>
-        <w:rPr>
-          <w:rFonts w:ascii="Times" w:hAnsi="Times"/>
-          <w:i/>
-          <w:iCs/>
-        </w:rPr>
-        <w:t>E</w:t>
-      </w:r>
-      <w:r>
-        <w:rPr>
-          <w:rFonts w:ascii="Times" w:hAnsi="Times"/>
-          <w:i/>
-          <w:iCs/>
-        </w:rPr>
-        <w:t xml:space="preserve">conomic </w:t>
-      </w:r>
-      <w:r>
-        <w:rPr>
-          <w:rFonts w:ascii="Times" w:hAnsi="Times"/>
-          <w:i/>
-          <w:iCs/>
-        </w:rPr>
-        <w:t>J</w:t>
-      </w:r>
-      <w:r>
-        <w:rPr>
-          <w:rFonts w:ascii="Times" w:hAnsi="Times"/>
-          <w:i/>
-          <w:iCs/>
-        </w:rPr>
-        <w:t>ournal</w:t>
-      </w:r>
-      <w:r>
-        <w:rPr>
-          <w:rFonts w:ascii="Times" w:hAnsi="Times"/>
-          <w:i/>
-          <w:iCs/>
-        </w:rPr>
-        <w:t>: Micro</w:t>
-      </w:r>
-      <w:r>
-        <w:rPr>
-          <w:rFonts w:ascii="Times" w:hAnsi="Times"/>
-          <w:i/>
-          <w:iCs/>
-        </w:rPr>
-        <w:t>economics</w:t>
-      </w:r>
-      <w:r>
-        <w:rPr>
-          <w:rFonts w:ascii="Times" w:hAnsi="Times"/>
-        </w:rPr>
-        <w:t xml:space="preserve">. </w:t>
+          <w:rFonts w:ascii="Times" w:hAnsi="Times" w:hint="eastAsia"/>
+          <w:i/>
+          <w:iCs/>
+          <w:lang w:eastAsia="zh-TW"/>
+        </w:rPr>
+        <w:t xml:space="preserve"/>
+      </w:r>
+      <w:r>
+        <w:rPr>
+          <w:rFonts w:ascii="Times" w:hAnsi="Times"/>
+          <w:i/>
+          <w:iCs/>
+          <w:lang w:eastAsia="zh-TW"/>
+        </w:rPr>
+        <w:t xml:space="preserve">Economic </w:t>
+      </w:r>
+      <w:r>
+        <w:rPr>
+          <w:rFonts w:ascii="Times" w:hAnsi="Times" w:hint="eastAsia"/>
+          <w:i/>
+          <w:iCs/>
+          <w:lang w:eastAsia="zh-TW"/>
+        </w:rPr>
+        <w:t xml:space="preserve">Journal, forthcoming</w:t>
       </w:r>
     </w:p>
     <w:p>
@@ -1719,16 +1711,7 @@
           <w:iCs/>
           <w:lang w:eastAsia="zh-TW"/>
         </w:rPr>
-        <w:t>Accepted</w:t>
-      </w:r>
-      <w:r>
-        <w:rPr>
-          <w:rFonts w:ascii="Times" w:hAnsi="Times" w:hint="eastAsia"/>
-          <w:i/>
-          <w:iCs/>
-          <w:lang w:eastAsia="zh-TW"/>
-        </w:rPr>
-        <w:t>, Journal of Development Economics</w:t>
+        <w:t>Journal of Development Economics, June 2026</w:t>
       </w:r>
     </w:p>
     <w:p>
@@ -1754,7 +1737,7 @@
         <w:rPr>
           <w:rFonts w:ascii="Times" w:hAnsi="Times"/>
         </w:rPr>
-        <w:t>Subsidize Rent or Subsidize Ownership? Evidence from a</w:t>
+        <w:t>Subsidize Rent or Subsidize Homeownership? Evidence from a</w:t>
       </w:r>
       <w:r>
         <w:rPr>
@@ -1784,59 +1767,12 @@
       </w:r>
       <w:r>
         <w:rPr>
-          <w:rFonts w:ascii="Times" w:hAnsi="Times" w:hint="eastAsia"/>
-          <w:i/>
-          <w:iCs/>
-          <w:lang w:eastAsia="zh-TW"/>
-        </w:rPr>
-        <w:t>Conditionally accepted</w:t>
-      </w:r>
-      <w:r>
-        <w:rPr>
-          <w:rFonts w:ascii="Times" w:hAnsi="Times" w:hint="eastAsia"/>
-          <w:i/>
-          <w:iCs/>
-          <w:lang w:eastAsia="zh-TW"/>
-        </w:rPr>
-        <w:t xml:space="preserve">, </w:t>
-      </w:r>
-      <w:r>
-        <w:rPr>
-          <w:rFonts w:ascii="Times" w:hAnsi="Times"/>
-          <w:i/>
-          <w:iCs/>
-          <w:lang w:eastAsia="zh-TW"/>
-        </w:rPr>
-        <w:t>Regional Science and Urban Economics</w:t>
-      </w:r>
-    </w:p>
-    <w:p>
-      <w:pPr>
-        <w:spacing w:after="120" w:line="276" w:lineRule="auto"/>
-        <w:rPr>
-          <w:rFonts w:ascii="Times" w:hAnsi="Times" w:hint="eastAsia"/>
-          <w:lang w:eastAsia="zh-TW"/>
-        </w:rPr>
-      </w:pPr>
-    </w:p>
-    <w:p>
-      <w:pPr>
-        <w:spacing w:line="360" w:lineRule="auto"/>
-        <w:rPr>
-          <w:rFonts w:ascii="Times" w:hAnsi="Times"/>
-          <w:b/>
-          <w:bCs/>
-          <w:sz w:val="4"/>
-          <w:szCs w:val="4"/>
-        </w:rPr>
-      </w:pPr>
-      <w:r>
-        <w:rPr>
-          <w:rFonts w:ascii="Times" w:hAnsi="Times"/>
-          <w:b/>
-          <w:bCs/>
-        </w:rPr>
-        <w:t>WORKING PAPERS</w:t>
+          <w:rFonts w:ascii="Times" w:hAnsi="Times"/>
+          <w:i/>
+          <w:iCs/>
+          <w:lang w:eastAsia="zh-TW"/>
+        </w:rPr>
+        <w:t>Regional Science and Urban Economics, forthcoming</w:t>
       </w:r>
     </w:p>
     <w:p>
@@ -1856,60 +1792,25 @@
         <w:rPr>
           <w:rFonts w:ascii="Times" w:hAnsi="Times"/>
         </w:rPr>
-        <w:t>“</w:t>
-      </w:r>
-      <w:r>
-        <w:rPr>
-          <w:rFonts w:ascii="Times" w:hAnsi="Times"/>
-          <w:lang w:eastAsia="zh-TW"/>
-        </w:rPr>
-        <w:t>Managerial Coordination</w:t>
-      </w:r>
-      <w:r>
-        <w:rPr>
-          <w:rFonts w:ascii="Times" w:hAnsi="Times" w:hint="eastAsia"/>
-          <w:lang w:eastAsia="zh-TW"/>
-        </w:rPr>
-        <w:t xml:space="preserve"> in</w:t>
-      </w:r>
-      <w:r>
-        <w:rPr>
-          <w:rFonts w:ascii="Times" w:hAnsi="Times"/>
-        </w:rPr>
-        <w:t xml:space="preserve"> Relational Contract</w:t>
-      </w:r>
-      <w:r>
-        <w:rPr>
-          <w:rFonts w:ascii="Times" w:hAnsi="Times" w:hint="eastAsia"/>
-          <w:lang w:eastAsia="zh-TW"/>
-        </w:rPr>
-        <w:t>ing Markets</w:t>
-      </w:r>
-      <w:r>
-        <w:rPr>
-          <w:rFonts w:ascii="Times" w:hAnsi="Times"/>
-        </w:rPr>
-        <w:t>”</w:t>
-      </w:r>
-      <w:r>
-        <w:rPr>
-          <w:rFonts w:ascii="Times" w:hAnsi="Times"/>
-        </w:rPr>
-        <w:t xml:space="preserve"> (with </w:t>
-      </w:r>
-      <w:proofErr w:type="spellStart"/>
-      <w:r>
-        <w:rPr>
-          <w:rFonts w:ascii="Times" w:hAnsi="Times"/>
-        </w:rPr>
-        <w:t>Duoxi</w:t>
-      </w:r>
-      <w:proofErr w:type="spellEnd"/>
-      <w:r>
-        <w:rPr>
-          <w:rFonts w:ascii="Times" w:hAnsi="Times"/>
-        </w:rPr>
-        <w:t xml:space="preserve"> Li)</w:t>
+        <w:t xml:space="preserve">“Ideological Bias and Trust in Information Sources” </w:t>
+      </w:r>
+      <w:r>
+        <w:rPr>
+          <w:rFonts w:ascii="Times" w:hAnsi="Times"/>
+        </w:rPr>
+        <w:t xml:space="preserve">(joint </w:t>
+      </w:r>
+      <w:r>
+        <w:rPr>
+          <w:rFonts w:ascii="Times" w:hAnsi="Times"/>
+        </w:rPr>
+        <w:t>with Matthew Gentzkow and Allen T. Zhang</w:t>
+      </w:r>
+      <w:r>
+        <w:rPr>
+          <w:rFonts w:ascii="Times" w:hAnsi="Times"/>
+        </w:rPr>
+        <w:t>)</w:t>
       </w:r>
       <w:r>
         <w:rPr>
@@ -1919,30 +1820,102 @@
       </w:r>
       <w:r>
         <w:rPr>
-          <w:rFonts w:ascii="Times" w:hAnsi="Times" w:hint="eastAsia"/>
-          <w:i/>
-          <w:iCs/>
-          <w:lang w:eastAsia="zh-TW"/>
-        </w:rPr>
-        <w:t xml:space="preserve">Revise and Resubmit, </w:t>
-      </w:r>
-      <w:r>
-        <w:rPr>
-          <w:rFonts w:ascii="Times" w:hAnsi="Times"/>
-          <w:i/>
-          <w:iCs/>
-          <w:lang w:eastAsia="zh-TW"/>
-        </w:rPr>
-        <w:t xml:space="preserve">Economic </w:t>
-      </w:r>
-      <w:r>
-        <w:rPr>
-          <w:rFonts w:ascii="Times" w:hAnsi="Times" w:hint="eastAsia"/>
-          <w:i/>
-          <w:iCs/>
-          <w:lang w:eastAsia="zh-TW"/>
-        </w:rPr>
-        <w:t xml:space="preserve">Journal </w:t>
+          <w:rFonts w:ascii="Times" w:hAnsi="Times"/>
+          <w:i/>
+          <w:iCs/>
+        </w:rPr>
+        <w:t>A</w:t>
+      </w:r>
+      <w:r>
+        <w:rPr>
+          <w:rFonts w:ascii="Times" w:hAnsi="Times"/>
+          <w:i/>
+          <w:iCs/>
+        </w:rPr>
+        <w:t xml:space="preserve">merican </w:t>
+      </w:r>
+      <w:r>
+        <w:rPr>
+          <w:rFonts w:ascii="Times" w:hAnsi="Times"/>
+          <w:i/>
+          <w:iCs/>
+        </w:rPr>
+        <w:t>E</w:t>
+      </w:r>
+      <w:r>
+        <w:rPr>
+          <w:rFonts w:ascii="Times" w:hAnsi="Times"/>
+          <w:i/>
+          <w:iCs/>
+        </w:rPr>
+        <w:t xml:space="preserve">conomic </w:t>
+      </w:r>
+      <w:r>
+        <w:rPr>
+          <w:rFonts w:ascii="Times" w:hAnsi="Times"/>
+          <w:i/>
+          <w:iCs/>
+        </w:rPr>
+        <w:t>J</w:t>
+      </w:r>
+      <w:r>
+        <w:rPr>
+          <w:rFonts w:ascii="Times" w:hAnsi="Times"/>
+          <w:i/>
+          <w:iCs/>
+        </w:rPr>
+        <w:t>ournal</w:t>
+      </w:r>
+      <w:r>
+        <w:rPr>
+          <w:rFonts w:ascii="Times" w:hAnsi="Times"/>
+          <w:i/>
+          <w:iCs/>
+        </w:rPr>
+        <w:t>: Micro</w:t>
+      </w:r>
+      <w:r>
+        <w:rPr>
+          <w:rFonts w:ascii="Times" w:hAnsi="Times"/>
+          <w:i/>
+          <w:iCs/>
+        </w:rPr>
+        <w:t>economics</w:t>
+      </w:r>
+      <w:r>
+        <w:rPr>
+          <w:rFonts w:ascii="Times" w:hAnsi="Times"/>
+        </w:rPr>
+        <w:t xml:space="preserve">. </w:t>
+      </w:r>
+    </w:p>
+    <w:p>
+      <w:pPr>
+        <w:spacing w:after="120" w:line="276" w:lineRule="auto"/>
+        <w:rPr>
+          <w:rFonts w:ascii="Times" w:hAnsi="Times" w:hint="eastAsia"/>
+          <w:lang w:eastAsia="zh-TW"/>
+        </w:rPr>
+      </w:pPr>
+    </w:p>
+    <w:p>
+      <w:pPr>
+        <w:spacing w:line="360" w:lineRule="auto"/>
+        <w:rPr>
+          <w:rFonts w:ascii="Times" w:hAnsi="Times"/>
+          <w:b/>
+          <w:bCs/>
+          <w:sz w:val="4"/>
+          <w:szCs w:val="4"/>
+        </w:rPr>
+      </w:pPr>
+      <w:r>
+        <w:rPr>
+          <w:rFonts w:ascii="Times" w:hAnsi="Times"/>
+          <w:b/>
+          <w:bCs/>
+        </w:rPr>
+        <w:t>WORKING PAPERS</w:t>
       </w:r>
     </w:p>
     <w:p>
@@ -1962,53 +1935,7 @@
         <w:rPr>
           <w:rFonts w:ascii="Times" w:hAnsi="Times"/>
         </w:rPr>
-        <w:t>“</w:t>
-      </w:r>
-      <w:r>
-        <w:rPr>
-          <w:rFonts w:ascii="Times" w:hAnsi="Times"/>
-        </w:rPr>
-        <w:t>The Promise and Perils of Platform Money: Evidence from a Barter Community</w:t>
-      </w:r>
-      <w:r>
-        <w:rPr>
-          <w:rFonts w:ascii="Times" w:hAnsi="Times"/>
-        </w:rPr>
-        <w:t>”</w:t>
-      </w:r>
-      <w:r>
-        <w:rPr>
-          <w:rFonts w:ascii="Times" w:hAnsi="Times" w:hint="eastAsia"/>
-          <w:lang w:eastAsia="zh-TW"/>
-        </w:rPr>
-        <w:t xml:space="preserve"> </w:t>
-      </w:r>
-      <w:r>
-        <w:rPr>
-          <w:rFonts w:ascii="Times" w:hAnsi="Times" w:hint="eastAsia"/>
-          <w:i/>
-          <w:iCs/>
-          <w:lang w:eastAsia="zh-TW"/>
-        </w:rPr>
-        <w:t xml:space="preserve">Revise and Resubmit, </w:t>
-      </w:r>
-      <w:r>
-        <w:rPr>
-          <w:rFonts w:ascii="Times" w:hAnsi="Times"/>
-          <w:i/>
-          <w:iCs/>
-          <w:lang w:eastAsia="zh-TW"/>
-        </w:rPr>
-        <w:t xml:space="preserve">Economic </w:t>
-      </w:r>
-      <w:r>
-        <w:rPr>
-          <w:rFonts w:ascii="Times" w:hAnsi="Times" w:hint="eastAsia"/>
-          <w:i/>
-          <w:iCs/>
-          <w:lang w:eastAsia="zh-TW"/>
-        </w:rPr>
-        <w:t>Journal</w:t>
+        <w:t xml:space="preserve">“Domestic Outsourcing and Young-worker Entry into the Formal Sector” (with Mayara Felix)</w:t>
       </w:r>
     </w:p>
     <w:p>
@@ -2028,37 +1955,7 @@
         <w:rPr>
           <w:rFonts w:ascii="Times" w:hAnsi="Times"/>
         </w:rPr>
-        <w:t>“Outsourcing</w:t>
-      </w:r>
-      <w:r>
-        <w:rPr>
-          <w:rFonts w:ascii="Times" w:hAnsi="Times"/>
-        </w:rPr>
-        <w:t>, Labor Market Frictions, and Employment</w:t>
-      </w:r>
-      <w:r>
-        <w:rPr>
-          <w:rFonts w:ascii="Times" w:hAnsi="Times"/>
-        </w:rPr>
-        <w:t xml:space="preserve">” </w:t>
-      </w:r>
-      <w:r>
-        <w:rPr>
-          <w:rFonts w:ascii="Times" w:hAnsi="Times"/>
-        </w:rPr>
-        <w:t>(</w:t>
-      </w:r>
-      <w:r>
-        <w:rPr>
-          <w:rFonts w:ascii="Times" w:hAnsi="Times"/>
-        </w:rPr>
-        <w:t>with Mayara Felix</w:t>
-      </w:r>
-      <w:r>
-        <w:rPr>
-          <w:rFonts w:ascii="Times" w:hAnsi="Times"/>
-        </w:rPr>
-        <w:t>)</w:t>
+        <w:t xml:space="preserve">“The Displacement Effects of Domestic Outsourcing” (with Mayara Felix)</w:t>
       </w:r>
     </w:p>
     <w:p>
@@ -2078,61 +1975,7 @@
         <w:rPr>
           <w:rFonts w:ascii="Times" w:hAnsi="Times"/>
         </w:rPr>
-        <w:t>“</w:t>
-      </w:r>
-      <w:r>
-        <w:rPr>
-          <w:rFonts w:ascii="Times" w:hAnsi="Times" w:hint="eastAsia"/>
-          <w:lang w:eastAsia="zh-TW"/>
-        </w:rPr>
-        <w:t xml:space="preserve">Platform Currency </w:t>
-      </w:r>
-      <w:r>
-        <w:rPr>
-          <w:rFonts w:ascii="Times" w:hAnsi="Times" w:hint="eastAsia"/>
-          <w:lang w:eastAsia="zh-TW"/>
-        </w:rPr>
-        <w:t xml:space="preserve">Adoption </w:t>
-      </w:r>
-      <w:r>
-        <w:rPr>
-          <w:rFonts w:ascii="Times" w:hAnsi="Times" w:hint="eastAsia"/>
-          <w:lang w:eastAsia="zh-TW"/>
-        </w:rPr>
-        <w:t xml:space="preserve">and </w:t>
-      </w:r>
-      <w:r>
-        <w:rPr>
-          <w:rFonts w:ascii="Times" w:hAnsi="Times" w:hint="eastAsia"/>
-          <w:lang w:eastAsia="zh-TW"/>
-        </w:rPr>
-        <w:t>Rede</w:t>
-      </w:r>
-      <w:r>
-        <w:rPr>
-          <w:rFonts w:ascii="Times" w:hAnsi="Times" w:hint="eastAsia"/>
-          <w:lang w:eastAsia="zh-TW"/>
-        </w:rPr>
-        <w:t xml:space="preserve">mption </w:t>
-      </w:r>
-      <w:r>
-        <w:rPr>
-          <w:rFonts w:ascii="Times" w:hAnsi="Times" w:hint="eastAsia"/>
-          <w:lang w:eastAsia="zh-TW"/>
-        </w:rPr>
-        <w:t>Design</w:t>
-      </w:r>
-      <w:r>
-        <w:rPr>
-          <w:rFonts w:ascii="Times" w:hAnsi="Times"/>
-        </w:rPr>
-        <w:t>”</w:t>
-      </w:r>
-      <w:r>
-        <w:rPr>
-          <w:rFonts w:ascii="Times" w:hAnsi="Times"/>
-        </w:rPr>
-        <w:t xml:space="preserve"> (with Baiyun Jing, Yang You, and Yulin Zhong)</w:t>
+        <w:t xml:space="preserve">“Relational Contracts and the Scope of Intermediary Firms”</w:t>
       </w:r>
     </w:p>
     <w:p>
@@ -2145,46 +1988,60 @@
         <w:spacing w:after="120" w:line="276" w:lineRule="auto"/>
         <w:contextualSpacing w:val="0"/>
         <w:rPr>
-          <w:rFonts w:ascii="Times" w:hAnsi="Times" w:hint="eastAsia"/>
-          <w:lang w:eastAsia="zh-TW"/>
-        </w:rPr>
-      </w:pPr>
-      <w:r>
-        <w:rPr>
-          <w:rFonts w:ascii="Times" w:hAnsi="Times"/>
-          <w:lang w:eastAsia="zh-TW"/>
-        </w:rPr>
-        <w:t>The Skill Content of AI: First-personal Experience and Returns to Human Capital</w:t>
-      </w:r>
-    </w:p>
-    <w:p>
-      <w:pPr>
-        <w:spacing w:line="360" w:lineRule="auto"/>
-        <w:rPr>
-          <w:rFonts w:ascii="Times" w:hAnsi="Times"/>
-          <w:b/>
-          <w:bCs/>
-        </w:rPr>
-      </w:pPr>
-    </w:p>
-    <w:p>
-      <w:pPr>
-        <w:spacing w:line="360" w:lineRule="auto"/>
-        <w:rPr>
-          <w:rFonts w:ascii="Times" w:hAnsi="Times"/>
-          <w:b/>
-          <w:bCs/>
-          <w:sz w:val="4"/>
-          <w:szCs w:val="4"/>
-        </w:rPr>
-      </w:pPr>
-      <w:r>
-        <w:rPr>
-          <w:rFonts w:ascii="Times" w:hAnsi="Times"/>
-          <w:b/>
-          <w:bCs/>
-        </w:rPr>
-        <w:t>WORK-IN-PROGRESS</w:t>
+          <w:rFonts w:ascii="Times" w:hAnsi="Times"/>
+        </w:rPr>
+      </w:pPr>
+      <w:r>
+        <w:rPr>
+          <w:rFonts w:ascii="Times" w:hAnsi="Times"/>
+        </w:rPr>
+        <w:t>“</w:t>
+      </w:r>
+      <w:r>
+        <w:rPr>
+          <w:rFonts w:ascii="Times" w:hAnsi="Times"/>
+        </w:rPr>
+        <w:t>The Promise and Perils of Platform Money: Evidence from a Barter Community</w:t>
+      </w:r>
+      <w:r>
+        <w:rPr>
+          <w:rFonts w:ascii="Times" w:hAnsi="Times"/>
+        </w:rPr>
+        <w:t>”</w:t>
+      </w:r>
+      <w:r>
+        <w:rPr>
+          <w:rFonts w:ascii="Times" w:hAnsi="Times" w:hint="eastAsia"/>
+          <w:lang w:eastAsia="zh-TW"/>
+        </w:rPr>
+        <w:t xml:space="preserve"> </w:t>
+      </w:r>
+      <w:r>
+        <w:rPr>
+          <w:rFonts w:ascii="Times" w:hAnsi="Times" w:hint="eastAsia"/>
+          <w:i/>
+          <w:iCs/>
+          <w:lang w:eastAsia="zh-TW"/>
+        </w:rPr>
+        <w:t xml:space="preserve">Revise and Resubmit, </w:t>
+      </w:r>
+      <w:r>
+        <w:rPr>
+          <w:rFonts w:ascii="Times" w:hAnsi="Times"/>
+          <w:i/>
+          <w:iCs/>
+          <w:lang w:eastAsia="zh-TW"/>
+        </w:rPr>
+        <w:t xml:space="preserve">Economic </w:t>
+      </w:r>
+      <w:r>
+        <w:rPr>
+          <w:rFonts w:ascii="Times" w:hAnsi="Times" w:hint="eastAsia"/>
+          <w:i/>
+          <w:iCs/>
+          <w:lang w:eastAsia="zh-TW"/>
+        </w:rPr>
+        <w:t>Journal</w:t>
       </w:r>
     </w:p>
     <w:p>
@@ -2204,49 +2061,43 @@
         <w:rPr>
           <w:rFonts w:ascii="Times" w:hAnsi="Times"/>
         </w:rPr>
-        <w:t>“</w:t>
-      </w:r>
-      <w:r>
-        <w:rPr>
-          <w:rFonts w:ascii="Times" w:hAnsi="Times"/>
-          <w:lang w:eastAsia="zh-TW"/>
-        </w:rPr>
-        <w:t>Housing Market Responses to Non-market Allocation: An Assignment Approach</w:t>
-      </w:r>
-      <w:r>
-        <w:rPr>
-          <w:rFonts w:ascii="Times" w:hAnsi="Times"/>
-        </w:rPr>
-        <w:t xml:space="preserve">” (with </w:t>
-      </w:r>
-      <w:r>
-        <w:rPr>
-          <w:rFonts w:ascii="Times" w:hAnsi="Times" w:hint="eastAsia"/>
-          <w:lang w:eastAsia="zh-TW"/>
-        </w:rPr>
-        <w:t xml:space="preserve">Jimmy Ho, Yulin Hong, and </w:t>
-      </w:r>
-      <w:proofErr w:type="spellStart"/>
-      <w:r>
-        <w:rPr>
-          <w:rFonts w:ascii="Times" w:hAnsi="Times" w:hint="eastAsia"/>
-          <w:lang w:eastAsia="zh-TW"/>
-        </w:rPr>
-        <w:t>Zhongji</w:t>
-      </w:r>
-      <w:proofErr w:type="spellEnd"/>
-      <w:r>
-        <w:rPr>
-          <w:rFonts w:ascii="Times" w:hAnsi="Times" w:hint="eastAsia"/>
-          <w:lang w:eastAsia="zh-TW"/>
-        </w:rPr>
-        <w:t xml:space="preserve"> Wei</w:t>
-      </w:r>
-      <w:r>
-        <w:rPr>
-          <w:rFonts w:ascii="Times" w:hAnsi="Times"/>
-        </w:rPr>
-        <w:t>)</w:t>
+        <w:t xml:space="preserve">“Redemption Design and Digital Currency Adoption” (with Baiyun Jing, Yang You, and Yulin Zhong)</w:t>
+      </w:r>
+    </w:p>
+    <w:p>
+      <w:pPr>
+        <w:spacing w:after="120" w:line="276" w:lineRule="auto"/>
+        <w:rPr>
+          <w:rFonts w:ascii="Times" w:hAnsi="Times"/>
+        </w:rPr>
+      </w:pPr>
+    </w:p>
+    <w:p>
+      <w:pPr>
+        <w:spacing w:line="360" w:lineRule="auto"/>
+        <w:rPr>
+          <w:rFonts w:ascii="Times" w:hAnsi="Times"/>
+          <w:b/>
+          <w:bCs/>
+          <w:sz w:val="4"/>
+          <w:szCs w:val="4"/>
+        </w:rPr>
+      </w:pPr>
+      <w:r>
+        <w:rPr>
+          <w:rFonts w:ascii="Times" w:hAnsi="Times"/>
+          <w:b/>
+          <w:bCs/>
+        </w:rPr>
+        <w:t>NON-PEER REVIEWED</w:t>
+      </w:r>
+      <w:r>
+        <w:rPr>
+          <w:rFonts w:ascii="Times" w:hAnsi="Times"/>
+          <w:b/>
+          <w:bCs/>
+        </w:rPr>
+        <w:t xml:space="preserve"> ARTICLES</w:t>
       </w:r>
     </w:p>
     <w:p>
@@ -2260,41 +2111,13 @@
         <w:contextualSpacing w:val="0"/>
         <w:rPr>
           <w:rFonts w:ascii="Times" w:hAnsi="Times"/>
-          <w:lang w:eastAsia="zh-TW"/>
-        </w:rPr>
-      </w:pPr>
-      <w:r>
-        <w:rPr>
-          <w:rFonts w:ascii="Times" w:hAnsi="Times"/>
-        </w:rPr>
-        <w:t>“</w:t>
-      </w:r>
-      <w:r>
-        <w:rPr>
-          <w:rFonts w:ascii="Times" w:hAnsi="Times"/>
-          <w:lang w:eastAsia="zh-TW"/>
-        </w:rPr>
-        <w:t>Moral Hazard and the Cost of In-kind Transfers: Evidence from Public Housing</w:t>
-      </w:r>
-      <w:r>
-        <w:rPr>
-          <w:rFonts w:ascii="Times" w:hAnsi="Times"/>
-        </w:rPr>
-        <w:t xml:space="preserve">” (with </w:t>
-      </w:r>
-      <w:r>
-        <w:rPr>
-          <w:rFonts w:ascii="Times" w:hAnsi="Times"/>
-          <w:lang w:eastAsia="zh-TW"/>
-        </w:rPr>
-        <w:t>Russell Tsz-Nga Wong</w:t>
-      </w:r>
-      <w:r>
-        <w:rPr>
-          <w:rFonts w:ascii="Times" w:hAnsi="Times"/>
-          <w:lang w:eastAsia="zh-TW"/>
-        </w:rPr>
-        <w:t>)</w:t>
+        </w:rPr>
+      </w:pPr>
+      <w:r>
+        <w:rPr>
+          <w:rFonts w:ascii="Times" w:hAnsi="Times"/>
+        </w:rPr>
+        <w:t xml:space="preserve">Anchoring Talent in the Northern Metropolis: Four Policy Proposals to Help Young Households Put Down Roots in Hong Kong’s New Economic Engine (HKFEI research report, 2026-7-12, with Alex Ngau)</w:t>
       </w:r>
     </w:p>
     <w:p>
@@ -2308,147 +2131,13 @@
         <w:contextualSpacing w:val="0"/>
         <w:rPr>
           <w:rFonts w:ascii="Times" w:hAnsi="Times"/>
-          <w:lang w:eastAsia="zh-TW"/>
-        </w:rPr>
-      </w:pPr>
-      <w:r>
-        <w:rPr>
-          <w:rFonts w:ascii="Times" w:hAnsi="Times"/>
-          <w:lang w:eastAsia="zh-TW"/>
-        </w:rPr>
-        <w:t>The Welfare Effects of Non-market Housing Allocation</w:t>
-      </w:r>
-      <w:r>
-        <w:rPr>
-          <w:rFonts w:ascii="Times" w:hAnsi="Times" w:hint="eastAsia"/>
-          <w:lang w:eastAsia="zh-TW"/>
-        </w:rPr>
-        <w:t xml:space="preserve"> </w:t>
-      </w:r>
-      <w:r>
-        <w:rPr>
-          <w:rFonts w:ascii="Times" w:hAnsi="Times"/>
-          <w:lang w:eastAsia="zh-TW"/>
-        </w:rPr>
-        <w:t xml:space="preserve">(with </w:t>
-      </w:r>
-      <w:proofErr w:type="spellStart"/>
-      <w:r>
-        <w:rPr>
-          <w:rFonts w:ascii="Times" w:hAnsi="Times"/>
-          <w:lang w:eastAsia="zh-TW"/>
-        </w:rPr>
-        <w:t>Zhongji</w:t>
-      </w:r>
-      <w:proofErr w:type="spellEnd"/>
-      <w:r>
-        <w:rPr>
-          <w:rFonts w:ascii="Times" w:hAnsi="Times"/>
-          <w:lang w:eastAsia="zh-TW"/>
-        </w:rPr>
-        <w:t xml:space="preserve"> Wei)</w:t>
-      </w:r>
-    </w:p>
-    <w:p>
-      <w:pPr>
-        <w:pStyle w:val="ListParagraph"/>
-        <w:numPr>
-          <w:ilvl w:val="0"/>
-          <w:numId w:val="1"/>
-        </w:numPr>
-        <w:spacing w:after="120" w:line="276" w:lineRule="auto"/>
-        <w:contextualSpacing w:val="0"/>
-        <w:rPr>
-          <w:rFonts w:ascii="Times" w:hAnsi="Times"/>
-          <w:lang w:eastAsia="zh-TW"/>
-        </w:rPr>
-      </w:pPr>
-      <w:r>
-        <w:rPr>
-          <w:rFonts w:ascii="Times" w:hAnsi="Times"/>
-          <w:lang w:eastAsia="zh-TW"/>
-        </w:rPr>
-        <w:t>Managerial Scope and Span in a Relational Economy</w:t>
-      </w:r>
-    </w:p>
-    <w:p>
-      <w:pPr>
-        <w:pStyle w:val="ListParagraph"/>
-        <w:numPr>
-          <w:ilvl w:val="0"/>
-          <w:numId w:val="1"/>
-        </w:numPr>
-        <w:spacing w:after="120" w:line="276" w:lineRule="auto"/>
-        <w:contextualSpacing w:val="0"/>
-        <w:rPr>
-          <w:rFonts w:ascii="Times" w:hAnsi="Times"/>
-          <w:lang w:eastAsia="zh-TW"/>
-        </w:rPr>
-      </w:pPr>
-      <w:r>
-        <w:rPr>
-          <w:rFonts w:ascii="Times" w:hAnsi="Times"/>
-          <w:lang w:eastAsia="zh-TW"/>
-        </w:rPr>
-        <w:t>Relational Hierarchies</w:t>
-      </w:r>
-    </w:p>
-    <w:p>
-      <w:pPr>
-        <w:pStyle w:val="ListParagraph"/>
-        <w:numPr>
-          <w:ilvl w:val="0"/>
-          <w:numId w:val="1"/>
-        </w:numPr>
-        <w:spacing w:after="120" w:line="276" w:lineRule="auto"/>
-        <w:contextualSpacing w:val="0"/>
-        <w:rPr>
-          <w:rFonts w:ascii="Times" w:hAnsi="Times"/>
-          <w:lang w:eastAsia="zh-TW"/>
-        </w:rPr>
-      </w:pPr>
-      <w:r>
-        <w:rPr>
-          <w:rFonts w:ascii="Times" w:hAnsi="Times"/>
-          <w:lang w:eastAsia="zh-TW"/>
-        </w:rPr>
-        <w:t>Relational Investment</w:t>
-      </w:r>
-    </w:p>
-    <w:p>
-      <w:pPr>
-        <w:spacing w:after="120" w:line="276" w:lineRule="auto"/>
-        <w:rPr>
-          <w:rFonts w:ascii="Times" w:hAnsi="Times"/>
-        </w:rPr>
-      </w:pPr>
-    </w:p>
-    <w:p>
-      <w:pPr>
-        <w:spacing w:line="360" w:lineRule="auto"/>
-        <w:rPr>
-          <w:rFonts w:ascii="Times" w:hAnsi="Times"/>
-          <w:b/>
-          <w:bCs/>
-          <w:sz w:val="4"/>
-          <w:szCs w:val="4"/>
-        </w:rPr>
-      </w:pPr>
-      <w:r>
-        <w:rPr>
-          <w:rFonts w:ascii="Times" w:hAnsi="Times"/>
-          <w:b/>
-          <w:bCs/>
-        </w:rPr>
-        <w:t>NON-PEER REVIEWED</w:t>
-      </w:r>
-      <w:r>
-        <w:rPr>
-          <w:rFonts w:ascii="Times" w:hAnsi="Times"/>
-          <w:b/>
-          <w:bCs/>
-        </w:rPr>
-        <w:t xml:space="preserve"> ARTICLES</w:t>
+        </w:rPr>
+      </w:pPr>
+      <w:r>
+        <w:rPr>
+          <w:rFonts w:ascii="Times" w:hAnsi="Times"/>
+        </w:rPr>
+        <w:t xml:space="preserve">Smaller and Smaller: Trends in the size of New Housing Units in Hong Kong, 1995-2024 (HKFEI research report, 2026-6-23, with Yuyang Ou and Alex Ngau)</w:t>
       </w:r>
     </w:p>
     <w:p>
@@ -2929,94 +2618,344 @@
     </w:p>
     <w:p>
       <w:pPr>
-        <w:spacing w:after="120" w:line="276" w:lineRule="auto"/>
-        <w:rPr>
-          <w:rFonts w:ascii="Times" w:hAnsi="Times"/>
-          <w:lang w:eastAsia="zh-TW"/>
-        </w:rPr>
-      </w:pPr>
-    </w:p>
-    <w:p>
-      <w:pPr>
-        <w:spacing w:line="360" w:lineRule="auto"/>
-        <w:rPr>
-          <w:rFonts w:ascii="Times" w:hAnsi="Times"/>
-          <w:b/>
-          <w:bCs/>
-          <w:sz w:val="4"/>
-          <w:szCs w:val="4"/>
-        </w:rPr>
-      </w:pPr>
-      <w:r>
-        <w:rPr>
-          <w:rFonts w:ascii="Times" w:hAnsi="Times"/>
-          <w:b/>
-          <w:bCs/>
-        </w:rPr>
-        <w:t>NON-PEER REVIEWED</w:t>
-      </w:r>
-      <w:r>
-        <w:rPr>
-          <w:rFonts w:ascii="Times" w:hAnsi="Times"/>
-          <w:b/>
-          <w:bCs/>
-        </w:rPr>
-        <w:t xml:space="preserve"> </w:t>
-      </w:r>
-      <w:proofErr w:type="gramStart"/>
-      <w:r>
-        <w:rPr>
-          <w:rFonts w:ascii="Times" w:hAnsi="Times"/>
-          <w:b/>
-          <w:bCs/>
-        </w:rPr>
-        <w:t>ARTICLE</w:t>
-      </w:r>
-      <w:r>
-        <w:rPr>
-          <w:rFonts w:ascii="Times" w:hAnsi="Times"/>
-          <w:b/>
-          <w:bCs/>
-        </w:rPr>
-        <w:t xml:space="preserve">S </w:t>
-      </w:r>
-      <w:r>
-        <w:rPr>
-          <w:rFonts w:ascii="Times" w:hAnsi="Times"/>
-          <w:b/>
-          <w:bCs/>
-          <w:sz w:val="4"/>
-          <w:szCs w:val="4"/>
-        </w:rPr>
-        <w:t xml:space="preserve"> </w:t>
-      </w:r>
-      <w:r>
-        <w:rPr>
-          <w:rFonts w:ascii="Times" w:hAnsi="Times" w:hint="eastAsia"/>
-          <w:b/>
-          <w:bCs/>
-          <w:lang w:eastAsia="zh-TW"/>
-        </w:rPr>
-        <w:t>(</w:t>
-      </w:r>
-      <w:proofErr w:type="gramEnd"/>
-      <w:r>
-        <w:rPr>
-          <w:rFonts w:ascii="Times" w:hAnsi="Times" w:hint="eastAsia"/>
-          <w:b/>
-          <w:bCs/>
-          <w:lang w:eastAsia="zh-TW"/>
-        </w:rPr>
-        <w:t>CHINESE)</w:t>
-      </w:r>
-    </w:p>
-    <w:p>
-      <w:pPr>
         <w:pStyle w:val="ListParagraph"/>
         <w:numPr>
           <w:ilvl w:val="0"/>
           <w:numId w:val="1"/>
         </w:numPr>
+        <w:spacing w:after="120" w:line="276" w:lineRule="auto"/>
+        <w:contextualSpacing w:val="0"/>
+        <w:rPr>
+          <w:rFonts w:ascii="Times" w:hAnsi="Times"/>
+        </w:rPr>
+      </w:pPr>
+      <w:r>
+        <w:rPr>
+          <w:rFonts w:ascii="Times" w:hAnsi="Times"/>
+        </w:rPr>
+        <w:t xml:space="preserve">“In Hong Kong’s Olympic glory, a glimpse of a hopeful new future” (South China Morning Post, 2021-8-4)</w:t>
+      </w:r>
+    </w:p>
+    <w:p>
+      <w:pPr>
+        <w:pStyle w:val="ListParagraph"/>
+        <w:numPr>
+          <w:ilvl w:val="0"/>
+          <w:numId w:val="1"/>
+        </w:numPr>
+        <w:spacing w:after="120" w:line="276" w:lineRule="auto"/>
+        <w:contextualSpacing w:val="0"/>
+        <w:rPr>
+          <w:rFonts w:ascii="Times" w:hAnsi="Times"/>
+        </w:rPr>
+      </w:pPr>
+      <w:r>
+        <w:rPr>
+          <w:rFonts w:ascii="Times" w:hAnsi="Times"/>
+        </w:rPr>
+        <w:t xml:space="preserve">“Liberal or conservative, Hongkongers must learn to listen to those they disagree with” (South China Morning Post, 2019-9-7, with Spike Lee and Josephine Au)</w:t>
+      </w:r>
+    </w:p>
+    <w:p>
+      <w:pPr>
+        <w:spacing w:after="120" w:line="276" w:lineRule="auto"/>
+        <w:rPr>
+          <w:rFonts w:ascii="Times" w:hAnsi="Times"/>
+          <w:lang w:eastAsia="zh-TW"/>
+        </w:rPr>
+      </w:pPr>
+    </w:p>
+    <w:p>
+      <w:pPr>
+        <w:spacing w:line="360" w:lineRule="auto"/>
+        <w:rPr>
+          <w:rFonts w:ascii="Times" w:hAnsi="Times"/>
+          <w:b/>
+          <w:bCs/>
+          <w:sz w:val="4"/>
+          <w:szCs w:val="4"/>
+        </w:rPr>
+      </w:pPr>
+      <w:r>
+        <w:rPr>
+          <w:rFonts w:ascii="Times" w:hAnsi="Times"/>
+          <w:b/>
+          <w:bCs/>
+        </w:rPr>
+        <w:t>NON-PEER REVIEWED</w:t>
+      </w:r>
+      <w:r>
+        <w:rPr>
+          <w:rFonts w:ascii="Times" w:hAnsi="Times"/>
+          <w:b/>
+          <w:bCs/>
+        </w:rPr>
+        <w:t xml:space="preserve"> </w:t>
+      </w:r>
+      <w:proofErr w:type="gramStart"/>
+      <w:r>
+        <w:rPr>
+          <w:rFonts w:ascii="Times" w:hAnsi="Times"/>
+          <w:b/>
+          <w:bCs/>
+        </w:rPr>
+        <w:t>ARTICLE</w:t>
+      </w:r>
+      <w:r>
+        <w:rPr>
+          <w:rFonts w:ascii="Times" w:hAnsi="Times"/>
+          <w:b/>
+          <w:bCs/>
+        </w:rPr>
+        <w:t xml:space="preserve">S </w:t>
+      </w:r>
+      <w:r>
+        <w:rPr>
+          <w:rFonts w:ascii="Times" w:hAnsi="Times"/>
+          <w:b/>
+          <w:bCs/>
+          <w:sz w:val="4"/>
+          <w:szCs w:val="4"/>
+        </w:rPr>
+        <w:t xml:space="preserve"> </w:t>
+      </w:r>
+      <w:r>
+        <w:rPr>
+          <w:rFonts w:ascii="Times" w:hAnsi="Times" w:hint="eastAsia"/>
+          <w:b/>
+          <w:bCs/>
+          <w:lang w:eastAsia="zh-TW"/>
+        </w:rPr>
+        <w:t>(</w:t>
+      </w:r>
+      <w:proofErr w:type="gramEnd"/>
+      <w:r>
+        <w:rPr>
+          <w:rFonts w:ascii="Times" w:hAnsi="Times" w:hint="eastAsia"/>
+          <w:b/>
+          <w:bCs/>
+          <w:lang w:eastAsia="zh-TW"/>
+        </w:rPr>
+        <w:t>CHINESE)</w:t>
+      </w:r>
+    </w:p>
+    <w:p>
+      <w:pPr>
+        <w:pStyle w:val="ListParagraph"/>
+        <w:numPr>
+          <w:ilvl w:val="0"/>
+          <w:numId w:val="1"/>
+        </w:numPr>
+        <w:spacing w:line="360" w:lineRule="auto"/>
+        <w:rPr>
+          <w:rFonts w:ascii="Times" w:hAnsi="Times"/>
+          <w:lang w:eastAsia="zh-TW"/>
+        </w:rPr>
+      </w:pPr>
+      <w:r>
+        <w:rPr>
+          <w:rFonts w:ascii="Times" w:hAnsi="Times" w:hint="eastAsia"/>
+          <w:lang w:eastAsia="zh-TW"/>
+        </w:rPr>
+        <w:t xml:space="preserve">從「磚頭」到成家：北部都會區需要一套讓青年扎根的政策 (明報, 2026-7-16, 與牛致行)</w:t>
+      </w:r>
+    </w:p>
+    <w:p>
+      <w:pPr>
+        <w:pStyle w:val="ListParagraph"/>
+        <w:numPr>
+          <w:ilvl w:val="0"/>
+          <w:numId w:val="1"/>
+        </w:numPr>
+        <w:spacing w:line="360" w:lineRule="auto"/>
+        <w:rPr>
+          <w:rFonts w:ascii="Times" w:hAnsi="Times"/>
+          <w:lang w:eastAsia="zh-TW"/>
+        </w:rPr>
+      </w:pPr>
+      <w:r>
+        <w:rPr>
+          <w:rFonts w:ascii="Times" w:hAnsi="Times" w:hint="eastAsia"/>
+          <w:lang w:eastAsia="zh-TW"/>
+        </w:rPr>
+        <w:t xml:space="preserve">北部都會區留住人才：四大政策方案，讓青年住戶扎根香港經濟新引擎 (未來經濟學院研究報告, 2026-7-12, 與牛致行)</w:t>
+      </w:r>
+    </w:p>
+    <w:p>
+      <w:pPr>
+        <w:pStyle w:val="ListParagraph"/>
+        <w:numPr>
+          <w:ilvl w:val="0"/>
+          <w:numId w:val="1"/>
+        </w:numPr>
+        <w:spacing w:line="360" w:lineRule="auto"/>
+        <w:rPr>
+          <w:rFonts w:ascii="Times" w:hAnsi="Times"/>
+          <w:lang w:eastAsia="zh-TW"/>
+        </w:rPr>
+      </w:pPr>
+      <w:r>
+        <w:rPr>
+          <w:rFonts w:ascii="Times" w:hAnsi="Times" w:hint="eastAsia"/>
+          <w:lang w:eastAsia="zh-TW"/>
+        </w:rPr>
+        <w:t xml:space="preserve">「精準」扶貧，香港需要數據基建 (明報, 2026-7-2, 與蔡欣庭)</w:t>
+      </w:r>
+    </w:p>
+    <w:p>
+      <w:pPr>
+        <w:pStyle w:val="ListParagraph"/>
+        <w:numPr>
+          <w:ilvl w:val="0"/>
+          <w:numId w:val="1"/>
+        </w:numPr>
+        <w:spacing w:line="360" w:lineRule="auto"/>
+        <w:rPr>
+          <w:rFonts w:ascii="Times" w:hAnsi="Times"/>
+          <w:lang w:eastAsia="zh-TW"/>
+        </w:rPr>
+      </w:pPr>
+      <w:r>
+        <w:rPr>
+          <w:rFonts w:ascii="Times" w:hAnsi="Times" w:hint="eastAsia"/>
+          <w:lang w:eastAsia="zh-TW"/>
+        </w:rPr>
+        <w:t xml:space="preserve">香港新建的房子，能容人嗎？ (明報, 2026-6-25)</w:t>
+      </w:r>
+    </w:p>
+    <w:p>
+      <w:pPr>
+        <w:pStyle w:val="ListParagraph"/>
+        <w:numPr>
+          <w:ilvl w:val="0"/>
+          <w:numId w:val="1"/>
+        </w:numPr>
+        <w:spacing w:line="360" w:lineRule="auto"/>
+        <w:rPr>
+          <w:rFonts w:ascii="Times" w:hAnsi="Times"/>
+          <w:lang w:eastAsia="zh-TW"/>
+        </w:rPr>
+      </w:pPr>
+      <w:r>
+        <w:rPr>
+          <w:rFonts w:ascii="Times" w:hAnsi="Times" w:hint="eastAsia"/>
+          <w:lang w:eastAsia="zh-TW"/>
+        </w:rPr>
+        <w:t xml:space="preserve">房委會兩策 讓單位流向最合適住戶 (信報, 2026-6-24, 與牛致行)</w:t>
+      </w:r>
+    </w:p>
+    <w:p>
+      <w:pPr>
+        <w:pStyle w:val="ListParagraph"/>
+        <w:numPr>
+          <w:ilvl w:val="0"/>
+          <w:numId w:val="1"/>
+        </w:numPr>
+        <w:spacing w:line="360" w:lineRule="auto"/>
+        <w:rPr>
+          <w:rFonts w:ascii="Times" w:hAnsi="Times"/>
+          <w:lang w:eastAsia="zh-TW"/>
+        </w:rPr>
+      </w:pPr>
+      <w:r>
+        <w:rPr>
+          <w:rFonts w:ascii="Times" w:hAnsi="Times" w:hint="eastAsia"/>
+          <w:lang w:eastAsia="zh-TW"/>
+        </w:rPr>
+        <w:t xml:space="preserve">愈建愈小：1995–2024 年香港新落成住宅單位面積變化 (未來經濟學院研究報告, 2026-6-23, 與歐煜陽和牛致行)</w:t>
+      </w:r>
+    </w:p>
+    <w:p>
+      <w:pPr>
+        <w:pStyle w:val="ListParagraph"/>
+        <w:numPr>
+          <w:ilvl w:val="0"/>
+          <w:numId w:val="1"/>
+        </w:numPr>
+        <w:spacing w:line="360" w:lineRule="auto"/>
+        <w:rPr>
+          <w:rFonts w:ascii="Times" w:hAnsi="Times"/>
+          <w:lang w:eastAsia="zh-TW"/>
+        </w:rPr>
+      </w:pPr>
+      <w:r>
+        <w:rPr>
+          <w:rFonts w:ascii="Times" w:hAnsi="Times" w:hint="eastAsia"/>
+          <w:lang w:eastAsia="zh-TW"/>
+        </w:rPr>
+        <w:t xml:space="preserve">不只是就業危機：AI正在切斷香港的人才培育管道 (明報, 2026-6-18, 與何杏研和趙藝婷)</w:t>
+      </w:r>
+    </w:p>
+    <w:p>
+      <w:pPr>
+        <w:pStyle w:val="ListParagraph"/>
+        <w:numPr>
+          <w:ilvl w:val="0"/>
+          <w:numId w:val="1"/>
+        </w:numPr>
+        <w:spacing w:line="360" w:lineRule="auto"/>
+        <w:rPr>
+          <w:rFonts w:ascii="Times" w:hAnsi="Times"/>
+          <w:lang w:eastAsia="zh-TW"/>
+        </w:rPr>
+      </w:pPr>
+      <w:r>
+        <w:rPr>
+          <w:rFonts w:ascii="Times" w:hAnsi="Times" w:hint="eastAsia"/>
+          <w:lang w:eastAsia="zh-TW"/>
+        </w:rPr>
+        <w:t xml:space="preserve">從殖民管治到對接國家規劃：香港需要建立政策研究生態 (明報, 2026-6-4, 與牛致行和宋恩榮)</w:t>
+      </w:r>
+    </w:p>
+    <w:p>
+      <w:pPr>
+        <w:pStyle w:val="ListParagraph"/>
+        <w:numPr>
+          <w:ilvl w:val="0"/>
+          <w:numId w:val="1"/>
+        </w:numPr>
+        <w:spacing w:line="360" w:lineRule="auto"/>
+        <w:rPr>
+          <w:rFonts w:ascii="Times" w:hAnsi="Times"/>
+          <w:lang w:eastAsia="zh-TW"/>
+        </w:rPr>
+      </w:pPr>
+      <w:r>
+        <w:rPr>
+          <w:rFonts w:ascii="Times" w:hAnsi="Times" w:hint="eastAsia"/>
+          <w:lang w:eastAsia="zh-TW"/>
+        </w:rPr>
+        <w:t xml:space="preserve">規劃不是諮詢：香港首份五年規劃的真正考驗 (明報, 2026-5-28, 與牛致行和宋恩榮)</w:t>
+      </w:r>
+    </w:p>
+    <w:p>
+      <w:pPr>
+        <w:pStyle w:val="ListParagraph"/>
+        <w:numPr>
+          <w:ilvl w:val="0"/>
+          <w:numId w:val="1"/>
+        </w:numPr>
+        <w:spacing w:line="360" w:lineRule="auto"/>
+        <w:rPr>
+          <w:rFonts w:ascii="Times" w:hAnsi="Times"/>
+          <w:lang w:eastAsia="zh-TW"/>
+        </w:rPr>
+      </w:pPr>
+      <w:r>
+        <w:rPr>
+          <w:rFonts w:ascii="Times" w:hAnsi="Times" w:hint="eastAsia"/>
+          <w:lang w:eastAsia="zh-TW"/>
+        </w:rPr>
+        <w:t xml:space="preserve">北都要做大灣區人才磁石：大學城倍增　洪水橋牛潭尾先行先試 (明報, 2026-5-12, 與牛致行和宋恩榮)</w:t>
+      </w:r>
+    </w:p>
+    <w:p>
+      <w:pPr>
+        <w:pStyle w:val="ListParagraph"/>
+        <w:numPr>
+          <w:ilvl w:val="0"/>
+          <w:numId w:val="1"/>
+        </w:numPr>
         <w:spacing w:line="360" w:lineRule="auto"/>
         <w:rPr>
           <w:rFonts w:ascii="Times" w:hAnsi="Times"/>
@@ -3051,7 +2990,7 @@
           <w:rFonts w:ascii="Times" w:hAnsi="Times"/>
           <w:lang w:eastAsia="zh-TW"/>
         </w:rPr>
-        <w:t xml:space="preserve">, 2026-5-7, </w:t>
+        <w:t xml:space="preserve">, 2026-5-6, </w:t>
       </w:r>
       <w:r>
         <w:rPr>

</xml_diff>

<commit_message>
Add HKFEI research report: 香港中小學 AI 應用與數據治理 (2026-8-3)
Adds the Chinese research report (未來經濟學院研究報告, 與何杏研和趙藝婷)
to content/sections/chinese_reports.md with its PDF, and the matching
entry to the CV's NON-PEER REVIEWED ARTICLES (CHINESE) list.

English version skipped: it carries "(Translation supported by AI)".
</commit_message>
<xml_diff>
--- a/static/CV.docx
+++ b/static/CV.docx
@@ -2737,6 +2737,27 @@
           <w:lang w:eastAsia="zh-TW"/>
         </w:rPr>
         <w:t>CHINESE)</w:t>
+      </w:r>
+    </w:p>
+    <w:p>
+      <w:pPr>
+        <w:pStyle w:val="ListParagraph"/>
+        <w:numPr>
+          <w:ilvl w:val="0"/>
+          <w:numId w:val="1"/>
+        </w:numPr>
+        <w:spacing w:line="360" w:lineRule="auto"/>
+        <w:rPr>
+          <w:rFonts w:ascii="Times" w:hAnsi="Times"/>
+          <w:lang w:eastAsia="zh-TW"/>
+        </w:rPr>
+      </w:pPr>
+      <w:r>
+        <w:rPr>
+          <w:rFonts w:ascii="Times" w:hAnsi="Times" w:hint="eastAsia"/>
+          <w:lang w:eastAsia="zh-TW"/>
+        </w:rPr>
+        <w:t xml:space="preserve">香港中小學 AI 應用與數據治理 (未來經濟學院研究報告, 2026-8-3, 與何杏研和趙藝婷)</w:t>
       </w:r>
     </w:p>
     <w:p>

</xml_diff>

<commit_message>
Add HKFEI article: AI時代，孩子該學甚麼？ (2026-7-30)
HKFEI no longer uploads PDFs, so this one is generated locally in their
house style from the WordPress REST API content.

English version skipped: it carries "(Translation supported by AI)".
</commit_message>
<xml_diff>
--- a/static/CV.docx
+++ b/static/CV.docx
@@ -2758,6 +2758,27 @@
           <w:lang w:eastAsia="zh-TW"/>
         </w:rPr>
         <w:t xml:space="preserve">香港中小學 AI 應用與數據治理 (未來經濟學院研究報告, 2026-8-3, 與何杏研和趙藝婷)</w:t>
+      </w:r>
+    </w:p>
+    <w:p>
+      <w:pPr>
+        <w:pStyle w:val="ListParagraph"/>
+        <w:numPr>
+          <w:ilvl w:val="0"/>
+          <w:numId w:val="1"/>
+        </w:numPr>
+        <w:spacing w:line="360" w:lineRule="auto"/>
+        <w:rPr>
+          <w:rFonts w:ascii="Times" w:hAnsi="Times"/>
+          <w:lang w:eastAsia="zh-TW"/>
+        </w:rPr>
+      </w:pPr>
+      <w:r>
+        <w:rPr>
+          <w:rFonts w:ascii="Times" w:hAnsi="Times" w:hint="eastAsia"/>
+          <w:lang w:eastAsia="zh-TW"/>
+        </w:rPr>
+        <w:t xml:space="preserve">AI時代，孩子該學甚麼？ (明報, 2026-7-30, 與何杏研和趙藝婷)</w:t>
       </w:r>
     </w:p>
     <w:p>

</xml_diff>

<commit_message>
Sync CV with website: two new articles, EJ and RSUE now published
- NON-PEER REVIEWED ARTICLES (CHINESE): added the 2026-8-27 and 2026-8-20
  明報 pieces at the top of the list.
- PUBLICATIONS: Managerial Coordination -> Economic Journal, July 2026;
  Subsidize Rent or Subsidize Homeownership? -> Regional Science and Urban
  Economics, September 2026; TPS moved above Managerial Coordination to
  match the site ordering.
- Re-rendered static/pdf/CV.pdf from the updated docx.

Co-Authored-By: Claude Opus 5 (1M context) <noreply@anthropic.com>
</commit_message>
<xml_diff>
--- a/static/CV.docx
+++ b/static/CV.docx
@@ -1548,29 +1548,22 @@
       <w:r>
         <w:rPr>
           <w:rFonts w:ascii="Times" w:hAnsi="Times"/>
-          <w:lang w:eastAsia="zh-TW"/>
-        </w:rPr>
-        <w:t>Managerial Coordination</w:t>
-      </w:r>
-      <w:r>
-        <w:rPr>
-          <w:rFonts w:ascii="Times" w:hAnsi="Times" w:hint="eastAsia"/>
-          <w:lang w:eastAsia="zh-TW"/>
-        </w:rPr>
-        <w:t xml:space="preserve"> in</w:t>
-      </w:r>
-      <w:r>
-        <w:rPr>
-          <w:rFonts w:ascii="Times" w:hAnsi="Times"/>
-        </w:rPr>
-        <w:t xml:space="preserve"> Decentralized Markets</w:t>
-      </w:r>
-      <w:r>
-        <w:rPr>
-          <w:rFonts w:ascii="Times" w:hAnsi="Times" w:hint="eastAsia"/>
-          <w:lang w:eastAsia="zh-TW"/>
-        </w:rPr>
-        <w:t xml:space="preserve"/>
+        </w:rPr>
+        <w:t>Subsidize Rent or Subsidize Homeownership? Evidence from a</w:t>
+      </w:r>
+      <w:r>
+        <w:rPr>
+          <w:rFonts w:ascii="Times" w:hAnsi="Times" w:hint="eastAsia"/>
+          <w:lang w:eastAsia="zh-TW"/>
+        </w:rPr>
+        <w:t xml:space="preserve"> Hong Kong</w:t>
+      </w:r>
+      <w:r>
+        <w:rPr>
+          <w:rFonts w:ascii="Times" w:hAnsi="Times"/>
+          <w:lang w:eastAsia="zh-TW"/>
+        </w:rPr>
+        <w:t xml:space="preserve"> Experiment</w:t>
       </w:r>
       <w:r>
         <w:rPr>
@@ -1582,54 +1575,16 @@
         <w:rPr>
           <w:rFonts w:ascii="Times" w:hAnsi="Times"/>
         </w:rPr>
-        <w:t xml:space="preserve"> (with </w:t>
-      </w:r>
-      <w:proofErr w:type="spellStart"/>
-      <w:r>
-        <w:rPr>
-          <w:rFonts w:ascii="Times" w:hAnsi="Times"/>
-        </w:rPr>
-        <w:t>Duoxi</w:t>
-      </w:r>
-      <w:proofErr w:type="spellEnd"/>
-      <w:r>
-        <w:rPr>
-          <w:rFonts w:ascii="Times" w:hAnsi="Times"/>
-        </w:rPr>
-        <w:t xml:space="preserve"> Li)</w:t>
-      </w:r>
-      <w:r>
-        <w:rPr>
-          <w:rFonts w:ascii="Times" w:hAnsi="Times"/>
-        </w:rPr>
         <w:t xml:space="preserve"> </w:t>
       </w:r>
       <w:r>
         <w:rPr>
-          <w:rFonts w:ascii="Times" w:hAnsi="Times" w:hint="eastAsia"/>
-          <w:i/>
-          <w:iCs/>
-          <w:lang w:eastAsia="zh-TW"/>
-        </w:rPr>
-        <w:t xml:space="preserve"/>
-      </w:r>
-      <w:r>
-        <w:rPr>
-          <w:rFonts w:ascii="Times" w:hAnsi="Times"/>
-          <w:i/>
-          <w:iCs/>
-          <w:lang w:eastAsia="zh-TW"/>
-        </w:rPr>
-        <w:t xml:space="preserve">Economic </w:t>
-      </w:r>
-      <w:r>
-        <w:rPr>
-          <w:rFonts w:ascii="Times" w:hAnsi="Times" w:hint="eastAsia"/>
-          <w:i/>
-          <w:iCs/>
-          <w:lang w:eastAsia="zh-TW"/>
-        </w:rPr>
-        <w:t xml:space="preserve">Journal, forthcoming</w:t>
+          <w:rFonts w:ascii="Times" w:hAnsi="Times"/>
+          <w:i/>
+          <w:iCs/>
+          <w:lang w:eastAsia="zh-TW"/>
+        </w:rPr>
+        <w:t>Regional Science and Urban Economics, September 2026</w:t>
       </w:r>
     </w:p>
     <w:p>
@@ -1654,8 +1609,29 @@
       <w:r>
         <w:rPr>
           <w:rFonts w:ascii="Times" w:hAnsi="Times"/>
-        </w:rPr>
-        <w:t>Domestic Outsourcing and Employment Security</w:t>
+          <w:lang w:eastAsia="zh-TW"/>
+        </w:rPr>
+        <w:t>Managerial Coordination</w:t>
+      </w:r>
+      <w:r>
+        <w:rPr>
+          <w:rFonts w:ascii="Times" w:hAnsi="Times" w:hint="eastAsia"/>
+          <w:lang w:eastAsia="zh-TW"/>
+        </w:rPr>
+        <w:t xml:space="preserve"> in</w:t>
+      </w:r>
+      <w:r>
+        <w:rPr>
+          <w:rFonts w:ascii="Times" w:hAnsi="Times"/>
+        </w:rPr>
+        <w:t xml:space="preserve"> Decentralized Markets</w:t>
+      </w:r>
+      <w:r>
+        <w:rPr>
+          <w:rFonts w:ascii="Times" w:hAnsi="Times" w:hint="eastAsia"/>
+          <w:lang w:eastAsia="zh-TW"/>
+        </w:rPr>
+        <w:t xml:space="preserve"/>
       </w:r>
       <w:r>
         <w:rPr>
@@ -1674,33 +1650,18 @@
         <w:rPr>
           <w:rFonts w:ascii="Times" w:hAnsi="Times"/>
         </w:rPr>
-        <w:t>Naijia</w:t>
+        <w:t>Duoxi</w:t>
       </w:r>
       <w:proofErr w:type="spellEnd"/>
       <w:r>
         <w:rPr>
           <w:rFonts w:ascii="Times" w:hAnsi="Times"/>
         </w:rPr>
-        <w:t xml:space="preserve"> Guo and </w:t>
-      </w:r>
-      <w:proofErr w:type="spellStart"/>
-      <w:r>
-        <w:rPr>
-          <w:rFonts w:ascii="Times" w:hAnsi="Times"/>
-        </w:rPr>
-        <w:t>Duoxi</w:t>
-      </w:r>
-      <w:proofErr w:type="spellEnd"/>
-      <w:r>
-        <w:rPr>
-          <w:rFonts w:ascii="Times" w:hAnsi="Times"/>
-        </w:rPr>
         <w:t xml:space="preserve"> Li)</w:t>
       </w:r>
       <w:r>
         <w:rPr>
-          <w:rFonts w:ascii="Times" w:hAnsi="Times" w:hint="eastAsia"/>
-          <w:lang w:eastAsia="zh-TW"/>
+          <w:rFonts w:ascii="Times" w:hAnsi="Times"/>
         </w:rPr>
         <w:t xml:space="preserve"> </w:t>
       </w:r>
@@ -1711,7 +1672,25 @@
           <w:iCs/>
           <w:lang w:eastAsia="zh-TW"/>
         </w:rPr>
-        <w:t>Journal of Development Economics, June 2026</w:t>
+        <w:t xml:space="preserve"/>
+      </w:r>
+      <w:r>
+        <w:rPr>
+          <w:rFonts w:ascii="Times" w:hAnsi="Times"/>
+          <w:i/>
+          <w:iCs/>
+          <w:lang w:eastAsia="zh-TW"/>
+        </w:rPr>
+        <w:t xml:space="preserve">Economic </w:t>
+      </w:r>
+      <w:r>
+        <w:rPr>
+          <w:rFonts w:ascii="Times" w:hAnsi="Times" w:hint="eastAsia"/>
+          <w:i/>
+          <w:iCs/>
+          <w:lang w:eastAsia="zh-TW"/>
+        </w:rPr>
+        <w:t xml:space="preserve">Journal, July 2026</w:t>
       </w:r>
     </w:p>
     <w:p>
@@ -1737,21 +1716,7 @@
         <w:rPr>
           <w:rFonts w:ascii="Times" w:hAnsi="Times"/>
         </w:rPr>
-        <w:t>Subsidize Rent or Subsidize Homeownership? Evidence from a</w:t>
-      </w:r>
-      <w:r>
-        <w:rPr>
-          <w:rFonts w:ascii="Times" w:hAnsi="Times" w:hint="eastAsia"/>
-          <w:lang w:eastAsia="zh-TW"/>
-        </w:rPr>
-        <w:t xml:space="preserve"> Hong Kong</w:t>
-      </w:r>
-      <w:r>
-        <w:rPr>
-          <w:rFonts w:ascii="Times" w:hAnsi="Times"/>
-          <w:lang w:eastAsia="zh-TW"/>
-        </w:rPr>
-        <w:t xml:space="preserve"> Experiment</w:t>
+        <w:t>Domestic Outsourcing and Employment Security</w:t>
       </w:r>
       <w:r>
         <w:rPr>
@@ -1763,16 +1728,51 @@
         <w:rPr>
           <w:rFonts w:ascii="Times" w:hAnsi="Times"/>
         </w:rPr>
+        <w:t xml:space="preserve"> (with </w:t>
+      </w:r>
+      <w:proofErr w:type="spellStart"/>
+      <w:r>
+        <w:rPr>
+          <w:rFonts w:ascii="Times" w:hAnsi="Times"/>
+        </w:rPr>
+        <w:t>Naijia</w:t>
+      </w:r>
+      <w:proofErr w:type="spellEnd"/>
+      <w:r>
+        <w:rPr>
+          <w:rFonts w:ascii="Times" w:hAnsi="Times"/>
+        </w:rPr>
+        <w:t xml:space="preserve"> Guo and </w:t>
+      </w:r>
+      <w:proofErr w:type="spellStart"/>
+      <w:r>
+        <w:rPr>
+          <w:rFonts w:ascii="Times" w:hAnsi="Times"/>
+        </w:rPr>
+        <w:t>Duoxi</w:t>
+      </w:r>
+      <w:proofErr w:type="spellEnd"/>
+      <w:r>
+        <w:rPr>
+          <w:rFonts w:ascii="Times" w:hAnsi="Times"/>
+        </w:rPr>
+        <w:t xml:space="preserve"> Li)</w:t>
+      </w:r>
+      <w:r>
+        <w:rPr>
+          <w:rFonts w:ascii="Times" w:hAnsi="Times" w:hint="eastAsia"/>
+          <w:lang w:eastAsia="zh-TW"/>
+        </w:rPr>
         <w:t xml:space="preserve"> </w:t>
       </w:r>
       <w:r>
         <w:rPr>
-          <w:rFonts w:ascii="Times" w:hAnsi="Times"/>
-          <w:i/>
-          <w:iCs/>
-          <w:lang w:eastAsia="zh-TW"/>
-        </w:rPr>
-        <w:t>Regional Science and Urban Economics, forthcoming</w:t>
+          <w:rFonts w:ascii="Times" w:hAnsi="Times" w:hint="eastAsia"/>
+          <w:i/>
+          <w:iCs/>
+          <w:lang w:eastAsia="zh-TW"/>
+        </w:rPr>
+        <w:t>Journal of Development Economics, June 2026</w:t>
       </w:r>
     </w:p>
     <w:p>
@@ -2737,6 +2737,48 @@
           <w:lang w:eastAsia="zh-TW"/>
         </w:rPr>
         <w:t>CHINESE)</w:t>
+      </w:r>
+    </w:p>
+    <w:p>
+      <w:pPr>
+        <w:pStyle w:val="ListParagraph"/>
+        <w:numPr>
+          <w:ilvl w:val="0"/>
+          <w:numId w:val="1"/>
+        </w:numPr>
+        <w:spacing w:line="360" w:lineRule="auto"/>
+        <w:rPr>
+          <w:rFonts w:ascii="Times" w:hAnsi="Times"/>
+          <w:lang w:eastAsia="zh-TW"/>
+        </w:rPr>
+      </w:pPr>
+      <w:r>
+        <w:rPr>
+          <w:rFonts w:ascii="Times" w:hAnsi="Times" w:hint="eastAsia"/>
+          <w:lang w:eastAsia="zh-TW"/>
+        </w:rPr>
+        <w:t xml:space="preserve">AI已入校，為何因材施教仍差一步？ (明報, 2026-8-27, 與何杏研和趙藝婷)</w:t>
+      </w:r>
+    </w:p>
+    <w:p>
+      <w:pPr>
+        <w:pStyle w:val="ListParagraph"/>
+        <w:numPr>
+          <w:ilvl w:val="0"/>
+          <w:numId w:val="1"/>
+        </w:numPr>
+        <w:spacing w:line="360" w:lineRule="auto"/>
+        <w:rPr>
+          <w:rFonts w:ascii="Times" w:hAnsi="Times"/>
+          <w:lang w:eastAsia="zh-TW"/>
+        </w:rPr>
+      </w:pPr>
+      <w:r>
+        <w:rPr>
+          <w:rFonts w:ascii="Times" w:hAnsi="Times" w:hint="eastAsia"/>
+          <w:lang w:eastAsia="zh-TW"/>
+        </w:rPr>
+        <w:t xml:space="preserve">AI教育的真正願景：因材施教不再是奢望 (明報, 2026-8-20, 與何杏研和趙藝婷)</w:t>
       </w:r>
     </w:p>
     <w:p>

</xml_diff>

<commit_message>
Remove "Relational Contracts and the Scope of Intermediary Firms"
The paper is not ready to be listed. Removed the entry from the website's
working-papers list and from the CV's WORKING PAPERS section, and dropped
static/pdf/scope.pdf so the draft is no longer downloadable from the
published site.

Kept the unrelated "Workshop on Relational Contracts" 2023 conference
venue in the CV. Re-rendered CV.pdf from the edited CV.docx.

Co-Authored-By: Claude Opus 5 (1M context) <noreply@anthropic.com>
</commit_message>
<xml_diff>
--- a/static/CV.docx
+++ b/static/CV.docx
@@ -1956,26 +1956,6 @@
           <w:rFonts w:ascii="Times" w:hAnsi="Times"/>
         </w:rPr>
         <w:t xml:space="preserve">“The Displacement Effects of Domestic Outsourcing” (with Mayara Felix)</w:t>
-      </w:r>
-    </w:p>
-    <w:p>
-      <w:pPr>
-        <w:pStyle w:val="ListParagraph"/>
-        <w:numPr>
-          <w:ilvl w:val="0"/>
-          <w:numId w:val="1"/>
-        </w:numPr>
-        <w:spacing w:after="120" w:line="276" w:lineRule="auto"/>
-        <w:contextualSpacing w:val="0"/>
-        <w:rPr>
-          <w:rFonts w:ascii="Times" w:hAnsi="Times"/>
-        </w:rPr>
-      </w:pPr>
-      <w:r>
-        <w:rPr>
-          <w:rFonts w:ascii="Times" w:hAnsi="Times"/>
-        </w:rPr>
-        <w:t xml:space="preserve">“Relational Contracts and the Scope of Intermediary Firms”</w:t>
       </w:r>
     </w:p>
     <w:p>

</xml_diff>

<commit_message>
Add J-PAL affiliation; add Economic Journal to reviewer list
Invited Researcher, Abdul Latif Jameel Poverty Action Lab (J-PAL),
2026- added to:
  - CV, at the top of RESEARCH AFFILIATIONS (external affiliations lead
    that list, ahead of the HKU-internal ones)
  - bio.docx, English and Chinese (賈米爾貧困行動實驗室（J-PAL）特邀研究員)
  - the About section's affiliation line, linked to povertyactionlab.org

Also added Economic Journal to the CV's Reviewer list, after Review of
Economics and Statistics.

Re-rendered CV.pdf and bio.pdf from the edited .docx sources.

Co-Authored-By: Claude Opus 5 (1M context) <noreply@anthropic.com>
</commit_message>
<xml_diff>
--- a/static/CV.docx
+++ b/static/CV.docx
@@ -476,6 +476,44 @@
         <w:rPr>
           <w:rFonts w:ascii="Times" w:hAnsi="Times"/>
         </w:rPr>
+        <w:t>Invited Researcher, Abdul Latif Jameel Poverty Action Lab (J-PAL)</w:t>
+      </w:r>
+      <w:r>
+        <w:rPr>
+          <w:rFonts w:ascii="Times" w:hAnsi="Times"/>
+        </w:rPr>
+        <w:tab/>
+      </w:r>
+      <w:r>
+        <w:rPr>
+          <w:rFonts w:ascii="Times" w:hAnsi="Times"/>
+        </w:rPr>
+        <w:tab/>
+      </w:r>
+      <w:r>
+        <w:rPr>
+          <w:rFonts w:ascii="Times" w:hAnsi="Times"/>
+        </w:rPr>
+        <w:tab/>
+      </w:r>
+      <w:r>
+        <w:rPr>
+          <w:rFonts w:ascii="Times" w:hAnsi="Times"/>
+        </w:rPr>
+        <w:t>2026-</w:t>
+      </w:r>
+    </w:p>
+    <w:p>
+      <w:pPr>
+        <w:spacing w:line="360" w:lineRule="auto"/>
+        <w:rPr>
+          <w:rFonts w:ascii="Times" w:hAnsi="Times"/>
+        </w:rPr>
+      </w:pPr>
+      <w:r>
+        <w:rPr>
+          <w:rFonts w:ascii="Times" w:hAnsi="Times"/>
+        </w:rPr>
         <w:t>Research</w:t>
       </w:r>
       <w:r>
@@ -4842,7 +4880,7 @@
           <w:iCs/>
           <w:lang w:eastAsia="zh-TW"/>
         </w:rPr>
-        <w:t xml:space="preserve">Review of Economics and Statistics; </w:t>
+        <w:t xml:space="preserve">Review of Economics and Statistics; Economic Journal; </w:t>
       </w:r>
       <w:r>
         <w:rPr>

</xml_diff>

<commit_message>
CV: split affiliations into INTERNATIONAL and HKU sections
RESEARCH AFFILIATIONS becomes INTERNATIONAL AFFILIATIONS (J-PAL, IZA at
LISER, Rockwool Berlin). The five HKU entries move to a new HKU
AFFILIATIONS section placed after COMMUNITY AFFILIATIONS. Each section is
reverse-chronological; COMMUNITY AFFILIATIONS was also resorted, as it
had been 2025/2026/2023.

Co-Authored-By: Claude Opus 5 (1M context) <noreply@anthropic.com>
</commit_message>
<xml_diff>
--- a/static/CV.docx
+++ b/static/CV.docx
@@ -392,7 +392,7 @@
           <w:b/>
           <w:bCs/>
         </w:rPr>
-        <w:t>RESEARCH</w:t>
+        <w:t>INTERNATIONAL</w:t>
       </w:r>
       <w:r>
         <w:rPr>
@@ -512,27 +512,40 @@
         </w:tabs>
         <w:spacing w:line="360" w:lineRule="auto"/>
         <w:rPr>
-          <w:rFonts w:ascii="Times" w:hAnsi="Times" w:hint="eastAsia"/>
-          <w:lang w:eastAsia="zh-TW"/>
-        </w:rPr>
-      </w:pPr>
-      <w:r>
-        <w:rPr>
-          <w:rFonts w:ascii="Times" w:hAnsi="Times"/>
-        </w:rPr>
-        <w:t>Faculty Affiliate</w:t>
-      </w:r>
-      <w:r>
-        <w:rPr>
-          <w:rFonts w:ascii="Times" w:hAnsi="Times"/>
-        </w:rPr>
-        <w:t xml:space="preserve">, HKU Stone Centre on </w:t>
-      </w:r>
-      <w:r>
-        <w:rPr>
-          <w:rFonts w:ascii="Times" w:hAnsi="Times"/>
-        </w:rPr>
-        <w:t>Socio-Economic Inequality in Asia</w:t>
+          <w:rFonts w:ascii="Times" w:hAnsi="Times"/>
+        </w:rPr>
+      </w:pPr>
+      <w:r>
+        <w:rPr>
+          <w:rFonts w:ascii="Times" w:hAnsi="Times"/>
+        </w:rPr>
+        <w:t>Research</w:t>
+      </w:r>
+      <w:r>
+        <w:rPr>
+          <w:rFonts w:ascii="Times" w:hAnsi="Times"/>
+        </w:rPr>
+        <w:t xml:space="preserve"> </w:t>
+      </w:r>
+      <w:r>
+        <w:rPr>
+          <w:rFonts w:ascii="Times" w:hAnsi="Times"/>
+        </w:rPr>
+        <w:t>Affiliate</w:t>
+      </w:r>
+      <w:r>
+        <w:rPr>
+          <w:rFonts w:ascii="Times" w:hAnsi="Times"/>
+          <w:i/>
+          <w:iCs/>
+        </w:rPr>
+        <w:t xml:space="preserve">, </w:t>
+      </w:r>
+      <w:r>
+        <w:rPr>
+          <w:rFonts w:ascii="Times" w:hAnsi="Times"/>
+        </w:rPr>
+        <w:t>Rockwool Foundation Berlin</w:t>
       </w:r>
       <w:r>
         <w:rPr>
@@ -544,7 +557,61 @@
         <w:rPr>
           <w:rFonts w:ascii="Times" w:hAnsi="Times"/>
         </w:rPr>
-        <w:t>2026-</w:t>
+        <w:t>202</w:t>
+      </w:r>
+      <w:r>
+        <w:rPr>
+          <w:rFonts w:ascii="Times" w:hAnsi="Times"/>
+        </w:rPr>
+        <w:t>5</w:t>
+      </w:r>
+      <w:r>
+        <w:rPr>
+          <w:rFonts w:ascii="Times" w:hAnsi="Times"/>
+        </w:rPr>
+        <w:t>-</w:t>
+      </w:r>
+      <w:r>
+        <w:rPr>
+          <w:rFonts w:ascii="Times" w:hAnsi="Times"/>
+        </w:rPr>
+        <w:t xml:space="preserve"> </w:t>
+      </w:r>
+    </w:p>
+    <w:p>
+      <w:pPr>
+        <w:spacing w:line="360" w:lineRule="auto"/>
+        <w:rPr>
+          <w:rFonts w:ascii="Times" w:hAnsi="Times"/>
+          <w:b/>
+          <w:bCs/>
+        </w:rPr>
+      </w:pPr>
+    </w:p>
+    <w:p>
+      <w:pPr>
+        <w:spacing w:line="360" w:lineRule="auto"/>
+        <w:rPr>
+          <w:rFonts w:ascii="Times" w:hAnsi="Times"/>
+          <w:i/>
+          <w:iCs/>
+        </w:rPr>
+      </w:pPr>
+      <w:r>
+        <w:rPr>
+          <w:rFonts w:ascii="Times" w:hAnsi="Times"/>
+          <w:b/>
+          <w:bCs/>
+        </w:rPr>
+        <w:t>COMMUNITY</w:t>
+      </w:r>
+      <w:r>
+        <w:rPr>
+          <w:rFonts w:ascii="Times" w:hAnsi="Times"/>
+          <w:b/>
+          <w:bCs/>
+        </w:rPr>
+        <w:t xml:space="preserve"> AFFILIATIONS</w:t>
       </w:r>
     </w:p>
     <w:p>
@@ -555,13 +622,40 @@
         <w:spacing w:line="360" w:lineRule="auto"/>
         <w:rPr>
           <w:rFonts w:ascii="Times" w:hAnsi="Times"/>
-        </w:rPr>
-      </w:pPr>
-      <w:r>
-        <w:rPr>
-          <w:rFonts w:ascii="Times" w:hAnsi="Times"/>
-        </w:rPr>
-        <w:t>Faculty Research Fellow</w:t>
+          <w:lang w:eastAsia="zh-TW"/>
+        </w:rPr>
+      </w:pPr>
+      <w:r>
+        <w:rPr>
+          <w:rFonts w:ascii="Times" w:hAnsi="Times"/>
+        </w:rPr>
+        <w:t>Member</w:t>
+      </w:r>
+      <w:r>
+        <w:rPr>
+          <w:rFonts w:ascii="Times" w:hAnsi="Times"/>
+        </w:rPr>
+        <w:t xml:space="preserve">, Hong Kong </w:t>
+      </w:r>
+      <w:r>
+        <w:rPr>
+          <w:rFonts w:ascii="Times" w:hAnsi="Times"/>
+        </w:rPr>
+        <w:t xml:space="preserve">Housing Authority, </w:t>
+      </w:r>
+      <w:proofErr w:type="spellStart"/>
+      <w:r>
+        <w:rPr>
+          <w:rFonts w:ascii="Times" w:hAnsi="Times"/>
+        </w:rPr>
+        <w:t>Subsidised</w:t>
+      </w:r>
+      <w:proofErr w:type="spellEnd"/>
+      <w:r>
+        <w:rPr>
+          <w:rFonts w:ascii="Times" w:hAnsi="Times"/>
+        </w:rPr>
+        <w:t xml:space="preserve"> Housing Committee</w:t>
       </w:r>
       <w:r>
         <w:rPr>
@@ -569,26 +663,6 @@
           <w:i/>
           <w:iCs/>
         </w:rPr>
-        <w:t xml:space="preserve">, </w:t>
-      </w:r>
-      <w:r>
-        <w:rPr>
-          <w:rFonts w:ascii="Times" w:hAnsi="Times"/>
-        </w:rPr>
-        <w:t xml:space="preserve">HKU </w:t>
-      </w:r>
-      <w:r>
-        <w:rPr>
-          <w:rFonts w:ascii="Times" w:hAnsi="Times"/>
-        </w:rPr>
-        <w:t>Center for AI, Management, and Organizations</w:t>
-      </w:r>
-      <w:r>
-        <w:rPr>
-          <w:rFonts w:ascii="Times" w:hAnsi="Times"/>
-          <w:i/>
-          <w:iCs/>
-        </w:rPr>
         <w:tab/>
       </w:r>
       <w:r>
@@ -608,12 +682,6 @@
           <w:rFonts w:ascii="Times" w:hAnsi="Times"/>
         </w:rPr>
         <w:t>-</w:t>
-      </w:r>
-      <w:r>
-        <w:rPr>
-          <w:rFonts w:ascii="Times" w:hAnsi="Times"/>
-        </w:rPr>
-        <w:t xml:space="preserve"> </w:t>
       </w:r>
     </w:p>
     <w:p>
@@ -624,43 +692,39 @@
         <w:spacing w:line="360" w:lineRule="auto"/>
         <w:rPr>
           <w:rFonts w:ascii="Times" w:hAnsi="Times"/>
-        </w:rPr>
-      </w:pPr>
-      <w:r>
-        <w:rPr>
-          <w:rFonts w:ascii="Times" w:hAnsi="Times"/>
-        </w:rPr>
-        <w:t>Research</w:t>
-      </w:r>
-      <w:r>
-        <w:rPr>
-          <w:rFonts w:ascii="Times" w:hAnsi="Times"/>
-        </w:rPr>
-        <w:t xml:space="preserve"> </w:t>
-      </w:r>
-      <w:r>
-        <w:rPr>
-          <w:rFonts w:ascii="Times" w:hAnsi="Times"/>
-        </w:rPr>
-        <w:t>Affiliate</w:t>
-      </w:r>
-      <w:r>
-        <w:rPr>
-          <w:rFonts w:ascii="Times" w:hAnsi="Times"/>
           <w:i/>
           <w:iCs/>
         </w:rPr>
-        <w:t xml:space="preserve">, </w:t>
-      </w:r>
-      <w:r>
-        <w:rPr>
-          <w:rFonts w:ascii="Times" w:hAnsi="Times"/>
-        </w:rPr>
-        <w:t>Rockwool Foundation Berlin</w:t>
-      </w:r>
-      <w:r>
-        <w:rPr>
-          <w:rFonts w:ascii="Times" w:hAnsi="Times"/>
+      </w:pPr>
+      <w:r>
+        <w:rPr>
+          <w:rFonts w:ascii="Times" w:hAnsi="Times"/>
+        </w:rPr>
+        <w:t xml:space="preserve">Founding </w:t>
+      </w:r>
+      <w:r>
+        <w:rPr>
+          <w:rFonts w:ascii="Times" w:hAnsi="Times"/>
+        </w:rPr>
+        <w:t>Director</w:t>
+      </w:r>
+      <w:r>
+        <w:rPr>
+          <w:rFonts w:ascii="Times" w:hAnsi="Times"/>
+        </w:rPr>
+        <w:t xml:space="preserve"> and Chairperson</w:t>
+      </w:r>
+      <w:r>
+        <w:rPr>
+          <w:rFonts w:ascii="Times" w:hAnsi="Times"/>
+        </w:rPr>
+        <w:t>, Hong Kong Future Economy Institute</w:t>
+      </w:r>
+      <w:r>
+        <w:rPr>
+          <w:rFonts w:ascii="Times" w:hAnsi="Times"/>
+          <w:i/>
+          <w:iCs/>
         </w:rPr>
         <w:tab/>
       </w:r>
@@ -681,12 +745,6 @@
           <w:rFonts w:ascii="Times" w:hAnsi="Times"/>
         </w:rPr>
         <w:t>-</w:t>
-      </w:r>
-      <w:r>
-        <w:rPr>
-          <w:rFonts w:ascii="Times" w:hAnsi="Times"/>
-        </w:rPr>
-        <w:t xml:space="preserve"> </w:t>
       </w:r>
     </w:p>
     <w:p>
@@ -703,53 +761,73 @@
         <w:rPr>
           <w:rFonts w:ascii="Times" w:hAnsi="Times"/>
         </w:rPr>
-        <w:t>Affiliated Researcher</w:t>
-      </w:r>
-      <w:r>
+        <w:t xml:space="preserve">External </w:t>
+      </w:r>
+      <w:r>
+        <w:rPr>
+          <w:rFonts w:ascii="Times" w:hAnsi="Times"/>
+        </w:rPr>
+        <w:t>Consultant, Hong Kong Jockey Club</w:t>
+      </w:r>
+      <w:r>
+        <w:rPr>
+          <w:rFonts w:ascii="Times" w:hAnsi="Times"/>
+        </w:rPr>
+        <w:tab/>
+      </w:r>
+      <w:r>
+        <w:rPr>
+          <w:rFonts w:ascii="Times" w:hAnsi="Times"/>
+        </w:rPr>
+        <w:t>202</w:t>
+      </w:r>
+      <w:r>
+        <w:rPr>
+          <w:rFonts w:ascii="Times" w:hAnsi="Times"/>
+        </w:rPr>
+        <w:t>3</w:t>
+      </w:r>
+      <w:r>
+        <w:rPr>
+          <w:rFonts w:ascii="Times" w:hAnsi="Times"/>
+        </w:rPr>
+        <w:t>-</w:t>
+      </w:r>
+    </w:p>
+    <w:p>
+      <w:pPr>
+        <w:spacing w:line="360" w:lineRule="auto"/>
+        <w:rPr>
+          <w:rFonts w:ascii="Times" w:hAnsi="Times"/>
+          <w:b/>
+          <w:bCs/>
+        </w:rPr>
+      </w:pPr>
+    </w:p>
+    <w:p>
+      <w:pPr>
+        <w:spacing w:line="360" w:lineRule="auto"/>
         <w:rPr>
           <w:rFonts w:ascii="Times" w:hAnsi="Times"/>
           <w:i/>
           <w:iCs/>
         </w:rPr>
-        <w:t xml:space="preserve">, </w:t>
-      </w:r>
-      <w:r>
-        <w:rPr>
-          <w:rFonts w:ascii="Times" w:hAnsi="Times"/>
-        </w:rPr>
-        <w:t>HKU Jockey Club ESG Research Institute</w:t>
-      </w:r>
-      <w:r>
-        <w:rPr>
-          <w:rFonts w:ascii="Times" w:hAnsi="Times"/>
-          <w:i/>
-          <w:iCs/>
-        </w:rPr>
-        <w:tab/>
-      </w:r>
-      <w:r>
-        <w:rPr>
-          <w:rFonts w:ascii="Times" w:hAnsi="Times"/>
-        </w:rPr>
-        <w:t>202</w:t>
-      </w:r>
-      <w:r>
-        <w:rPr>
-          <w:rFonts w:ascii="Times" w:hAnsi="Times"/>
-        </w:rPr>
-        <w:t>4</w:t>
-      </w:r>
-      <w:r>
-        <w:rPr>
-          <w:rFonts w:ascii="Times" w:hAnsi="Times"/>
-        </w:rPr>
-        <w:t>-</w:t>
-      </w:r>
-      <w:r>
-        <w:rPr>
-          <w:rFonts w:ascii="Times" w:hAnsi="Times"/>
-        </w:rPr>
-        <w:t xml:space="preserve"> </w:t>
+      </w:pPr>
+      <w:r>
+        <w:rPr>
+          <w:rFonts w:ascii="Times" w:hAnsi="Times"/>
+          <w:b/>
+          <w:bCs/>
+        </w:rPr>
+        <w:t>HKU</w:t>
+      </w:r>
+      <w:r>
+        <w:rPr>
+          <w:rFonts w:ascii="Times" w:hAnsi="Times"/>
+          <w:b/>
+          <w:bCs/>
+        </w:rPr>
+        <w:t xml:space="preserve"> AFFILIATIONS</w:t>
       </w:r>
     </w:p>
     <w:p>
@@ -759,32 +837,31 @@
         </w:tabs>
         <w:spacing w:line="360" w:lineRule="auto"/>
         <w:rPr>
-          <w:rFonts w:ascii="Times" w:hAnsi="Times"/>
-        </w:rPr>
-      </w:pPr>
-      <w:r>
-        <w:rPr>
-          <w:rFonts w:ascii="Times" w:hAnsi="Times"/>
-        </w:rPr>
-        <w:t>Fellow</w:t>
-      </w:r>
-      <w:r>
-        <w:rPr>
-          <w:rFonts w:ascii="Times" w:hAnsi="Times"/>
-        </w:rPr>
-        <w:t xml:space="preserve">, HKU </w:t>
-      </w:r>
-      <w:r>
-        <w:rPr>
-          <w:rFonts w:ascii="Times" w:hAnsi="Times"/>
-        </w:rPr>
-        <w:t>Centre on Contemporary China and the World</w:t>
-      </w:r>
-      <w:r>
-        <w:rPr>
-          <w:rFonts w:ascii="Times" w:hAnsi="Times"/>
-          <w:i/>
-          <w:iCs/>
+          <w:rFonts w:ascii="Times" w:hAnsi="Times" w:hint="eastAsia"/>
+          <w:lang w:eastAsia="zh-TW"/>
+        </w:rPr>
+      </w:pPr>
+      <w:r>
+        <w:rPr>
+          <w:rFonts w:ascii="Times" w:hAnsi="Times"/>
+        </w:rPr>
+        <w:t>Faculty Affiliate</w:t>
+      </w:r>
+      <w:r>
+        <w:rPr>
+          <w:rFonts w:ascii="Times" w:hAnsi="Times"/>
+        </w:rPr>
+        <w:t xml:space="preserve">, HKU Stone Centre on </w:t>
+      </w:r>
+      <w:r>
+        <w:rPr>
+          <w:rFonts w:ascii="Times" w:hAnsi="Times"/>
+        </w:rPr>
+        <w:t>Socio-Economic Inequality in Asia</w:t>
+      </w:r>
+      <w:r>
+        <w:rPr>
+          <w:rFonts w:ascii="Times" w:hAnsi="Times"/>
         </w:rPr>
         <w:tab/>
       </w:r>
@@ -792,19 +869,7 @@
         <w:rPr>
           <w:rFonts w:ascii="Times" w:hAnsi="Times"/>
         </w:rPr>
-        <w:t>202</w:t>
-      </w:r>
-      <w:r>
-        <w:rPr>
-          <w:rFonts w:ascii="Times" w:hAnsi="Times"/>
-        </w:rPr>
-        <w:t>3</w:t>
-      </w:r>
-      <w:r>
-        <w:rPr>
-          <w:rFonts w:ascii="Times" w:hAnsi="Times"/>
-        </w:rPr>
-        <w:t>-</w:t>
+        <w:t>2026-</w:t>
       </w:r>
     </w:p>
     <w:p>
@@ -821,7 +886,7 @@
         <w:rPr>
           <w:rFonts w:ascii="Times" w:hAnsi="Times"/>
         </w:rPr>
-        <w:t>Member, HKU Real Estate Lab</w:t>
+        <w:t>Faculty Research Fellow</w:t>
       </w:r>
       <w:r>
         <w:rPr>
@@ -829,61 +894,51 @@
           <w:i/>
           <w:iCs/>
         </w:rPr>
-        <w:tab/>
-      </w:r>
-      <w:r>
-        <w:rPr>
-          <w:rFonts w:ascii="Times" w:hAnsi="Times"/>
-        </w:rPr>
-        <w:t>202</w:t>
-      </w:r>
-      <w:r>
-        <w:rPr>
-          <w:rFonts w:ascii="Times" w:hAnsi="Times"/>
-        </w:rPr>
-        <w:t>3</w:t>
-      </w:r>
-      <w:r>
-        <w:rPr>
-          <w:rFonts w:ascii="Times" w:hAnsi="Times"/>
-        </w:rPr>
-        <w:t>-</w:t>
-      </w:r>
-    </w:p>
-    <w:p>
-      <w:pPr>
-        <w:spacing w:line="360" w:lineRule="auto"/>
-        <w:rPr>
-          <w:rFonts w:ascii="Times" w:hAnsi="Times"/>
-          <w:b/>
-          <w:bCs/>
-        </w:rPr>
-      </w:pPr>
-    </w:p>
-    <w:p>
-      <w:pPr>
-        <w:spacing w:line="360" w:lineRule="auto"/>
+        <w:t xml:space="preserve">, </w:t>
+      </w:r>
+      <w:r>
+        <w:rPr>
+          <w:rFonts w:ascii="Times" w:hAnsi="Times"/>
+        </w:rPr>
+        <w:t xml:space="preserve">HKU </w:t>
+      </w:r>
+      <w:r>
+        <w:rPr>
+          <w:rFonts w:ascii="Times" w:hAnsi="Times"/>
+        </w:rPr>
+        <w:t>Center for AI, Management, and Organizations</w:t>
+      </w:r>
+      <w:r>
         <w:rPr>
           <w:rFonts w:ascii="Times" w:hAnsi="Times"/>
           <w:i/>
           <w:iCs/>
         </w:rPr>
-      </w:pPr>
-      <w:r>
-        <w:rPr>
-          <w:rFonts w:ascii="Times" w:hAnsi="Times"/>
-          <w:b/>
-          <w:bCs/>
-        </w:rPr>
-        <w:t>COMMUNITY</w:t>
-      </w:r>
-      <w:r>
-        <w:rPr>
-          <w:rFonts w:ascii="Times" w:hAnsi="Times"/>
-          <w:b/>
-          <w:bCs/>
-        </w:rPr>
-        <w:t xml:space="preserve"> AFFILIATIONS</w:t>
+        <w:tab/>
+      </w:r>
+      <w:r>
+        <w:rPr>
+          <w:rFonts w:ascii="Times" w:hAnsi="Times"/>
+        </w:rPr>
+        <w:t>202</w:t>
+      </w:r>
+      <w:r>
+        <w:rPr>
+          <w:rFonts w:ascii="Times" w:hAnsi="Times"/>
+        </w:rPr>
+        <w:t>6</w:t>
+      </w:r>
+      <w:r>
+        <w:rPr>
+          <w:rFonts w:ascii="Times" w:hAnsi="Times"/>
+        </w:rPr>
+        <w:t>-</w:t>
+      </w:r>
+      <w:r>
+        <w:rPr>
+          <w:rFonts w:ascii="Times" w:hAnsi="Times"/>
+        </w:rPr>
+        <w:t xml:space="preserve"> </w:t>
       </w:r>
     </w:p>
     <w:p>
@@ -894,33 +949,27 @@
         <w:spacing w:line="360" w:lineRule="auto"/>
         <w:rPr>
           <w:rFonts w:ascii="Times" w:hAnsi="Times"/>
+        </w:rPr>
+      </w:pPr>
+      <w:r>
+        <w:rPr>
+          <w:rFonts w:ascii="Times" w:hAnsi="Times"/>
+        </w:rPr>
+        <w:t>Affiliated Researcher</w:t>
+      </w:r>
+      <w:r>
+        <w:rPr>
+          <w:rFonts w:ascii="Times" w:hAnsi="Times"/>
           <w:i/>
           <w:iCs/>
         </w:rPr>
-      </w:pPr>
-      <w:r>
-        <w:rPr>
-          <w:rFonts w:ascii="Times" w:hAnsi="Times"/>
-        </w:rPr>
-        <w:t xml:space="preserve">Founding </w:t>
-      </w:r>
-      <w:r>
-        <w:rPr>
-          <w:rFonts w:ascii="Times" w:hAnsi="Times"/>
-        </w:rPr>
-        <w:t>Director</w:t>
-      </w:r>
-      <w:r>
-        <w:rPr>
-          <w:rFonts w:ascii="Times" w:hAnsi="Times"/>
-        </w:rPr>
-        <w:t xml:space="preserve"> and Chairperson</w:t>
-      </w:r>
-      <w:r>
-        <w:rPr>
-          <w:rFonts w:ascii="Times" w:hAnsi="Times"/>
-        </w:rPr>
-        <w:t>, Hong Kong Future Economy Institute</w:t>
+        <w:t xml:space="preserve">, </w:t>
+      </w:r>
+      <w:r>
+        <w:rPr>
+          <w:rFonts w:ascii="Times" w:hAnsi="Times"/>
+        </w:rPr>
+        <w:t>HKU Jockey Club ESG Research Institute</w:t>
       </w:r>
       <w:r>
         <w:rPr>
@@ -940,13 +989,19 @@
         <w:rPr>
           <w:rFonts w:ascii="Times" w:hAnsi="Times"/>
         </w:rPr>
-        <w:t>5</w:t>
+        <w:t>4</w:t>
       </w:r>
       <w:r>
         <w:rPr>
           <w:rFonts w:ascii="Times" w:hAnsi="Times"/>
         </w:rPr>
         <w:t>-</w:t>
+      </w:r>
+      <w:r>
+        <w:rPr>
+          <w:rFonts w:ascii="Times" w:hAnsi="Times"/>
+        </w:rPr>
+        <w:t xml:space="preserve"> </w:t>
       </w:r>
     </w:p>
     <w:p>
@@ -957,40 +1012,25 @@
         <w:spacing w:line="360" w:lineRule="auto"/>
         <w:rPr>
           <w:rFonts w:ascii="Times" w:hAnsi="Times"/>
-          <w:lang w:eastAsia="zh-TW"/>
-        </w:rPr>
-      </w:pPr>
-      <w:r>
-        <w:rPr>
-          <w:rFonts w:ascii="Times" w:hAnsi="Times"/>
-        </w:rPr>
-        <w:t>Member</w:t>
-      </w:r>
-      <w:r>
-        <w:rPr>
-          <w:rFonts w:ascii="Times" w:hAnsi="Times"/>
-        </w:rPr>
-        <w:t xml:space="preserve">, Hong Kong </w:t>
-      </w:r>
-      <w:r>
-        <w:rPr>
-          <w:rFonts w:ascii="Times" w:hAnsi="Times"/>
-        </w:rPr>
-        <w:t xml:space="preserve">Housing Authority, </w:t>
-      </w:r>
-      <w:proofErr w:type="spellStart"/>
-      <w:r>
-        <w:rPr>
-          <w:rFonts w:ascii="Times" w:hAnsi="Times"/>
-        </w:rPr>
-        <w:t>Subsidised</w:t>
-      </w:r>
-      <w:proofErr w:type="spellEnd"/>
-      <w:r>
-        <w:rPr>
-          <w:rFonts w:ascii="Times" w:hAnsi="Times"/>
-        </w:rPr>
-        <w:t xml:space="preserve"> Housing Committee</w:t>
+        </w:rPr>
+      </w:pPr>
+      <w:r>
+        <w:rPr>
+          <w:rFonts w:ascii="Times" w:hAnsi="Times"/>
+        </w:rPr>
+        <w:t>Fellow</w:t>
+      </w:r>
+      <w:r>
+        <w:rPr>
+          <w:rFonts w:ascii="Times" w:hAnsi="Times"/>
+        </w:rPr>
+        <w:t xml:space="preserve">, HKU </w:t>
+      </w:r>
+      <w:r>
+        <w:rPr>
+          <w:rFonts w:ascii="Times" w:hAnsi="Times"/>
+        </w:rPr>
+        <w:t>Centre on Contemporary China and the World</w:t>
       </w:r>
       <w:r>
         <w:rPr>
@@ -1010,7 +1050,7 @@
         <w:rPr>
           <w:rFonts w:ascii="Times" w:hAnsi="Times"/>
         </w:rPr>
-        <w:t>6</w:t>
+        <w:t>3</w:t>
       </w:r>
       <w:r>
         <w:rPr>
@@ -1033,17 +1073,13 @@
         <w:rPr>
           <w:rFonts w:ascii="Times" w:hAnsi="Times"/>
         </w:rPr>
-        <w:t xml:space="preserve">External </w:t>
-      </w:r>
-      <w:r>
-        <w:rPr>
-          <w:rFonts w:ascii="Times" w:hAnsi="Times"/>
-        </w:rPr>
-        <w:t>Consultant, Hong Kong Jockey Club</w:t>
-      </w:r>
-      <w:r>
-        <w:rPr>
-          <w:rFonts w:ascii="Times" w:hAnsi="Times"/>
+        <w:t>Member, HKU Real Estate Lab</w:t>
+      </w:r>
+      <w:r>
+        <w:rPr>
+          <w:rFonts w:ascii="Times" w:hAnsi="Times"/>
+          <w:i/>
+          <w:iCs/>
         </w:rPr>
         <w:tab/>
       </w:r>

</xml_diff>

<commit_message>
CV: add Journal of Institutional and Theoretical Economics to reviewer list
Co-Authored-By: Claude Opus 5 (1M context) <noreply@anthropic.com>
</commit_message>
<xml_diff>
--- a/static/CV.docx
+++ b/static/CV.docx
@@ -4514,6 +4514,14 @@
           <w:iCs/>
         </w:rPr>
         <w:t xml:space="preserve">; </w:t>
+      </w:r>
+      <w:r>
+        <w:rPr>
+          <w:rFonts w:ascii="Times" w:hAnsi="Times"/>
+          <w:i/>
+          <w:iCs/>
+        </w:rPr>
+        <w:t xml:space="preserve">Journal of Institutional and Theoretical Economics; </w:t>
       </w:r>
       <w:r>
         <w:rPr>

</xml_diff>